<commit_message>
checkpoint: pre-UI/UX fixes snapshot (2026-03-17)
Savepoint before applying UI/UX Pro Max review fixes.
To restore: git reset --hard HEAD (before applying next commit)

Co-Authored-By: Claude Sonnet 4.6 <noreply@anthropic.com>
</commit_message>
<xml_diff>
--- a/public/products/Aluminium-Metal-Mouse-pad-01/产品描述.docx
+++ b/public/products/Aluminium-Metal-Mouse-pad-01/产品描述.docx
@@ -3,94 +3,121 @@
 <w:document xmlns:wpc="http://schemas.microsoft.com/office/word/2010/wordprocessingCanvas" xmlns:cx="http://schemas.microsoft.com/office/drawing/2014/chartex" xmlns:cx1="http://schemas.microsoft.com/office/drawing/2015/9/8/chartex" xmlns:cx2="http://schemas.microsoft.com/office/drawing/2015/10/21/chartex" xmlns:cx3="http://schemas.microsoft.com/office/drawing/2016/5/9/chartex" xmlns:cx4="http://schemas.microsoft.com/office/drawing/2016/5/10/chartex" xmlns:cx5="http://schemas.microsoft.com/office/drawing/2016/5/11/chartex" xmlns:cx6="http://schemas.microsoft.com/office/drawing/2016/5/12/chartex" xmlns:cx7="http://schemas.microsoft.com/office/drawing/2016/5/13/chartex" xmlns:cx8="http://schemas.microsoft.com/office/drawing/2016/5/14/chartex" xmlns:mc="http://schemas.openxmlformats.org/markup-compatibility/2006" xmlns:aink="http://schemas.microsoft.com/office/drawing/2016/ink" xmlns:am3d="http://schemas.microsoft.com/office/drawing/2017/model3d" xmlns:o="urn:schemas-microsoft-com:office:office" xmlns:oel="http://schemas.microsoft.com/office/2019/extlst" xmlns:r="http://schemas.openxmlformats.org/officeDocument/2006/relationships" xmlns:m="http://schemas.openxmlformats.org/officeDocument/2006/math" xmlns:v="urn:schemas-microsoft-com:vml" xmlns:wp14="http://schemas.microsoft.com/office/word/2010/wordprocessingDrawing" xmlns:wp="http://schemas.openxmlformats.org/drawingml/2006/wordprocessingDrawing" xmlns:w10="urn:schemas-microsoft-com:office:word" xmlns:w="http://schemas.openxmlformats.org/wordprocessingml/2006/main" xmlns:w14="http://schemas.microsoft.com/office/word/2010/wordml" xmlns:w15="http://schemas.microsoft.com/office/word/2012/wordml" xmlns:w16cex="http://schemas.microsoft.com/office/word/2018/wordml/cex" xmlns:w16cid="http://schemas.microsoft.com/office/word/2016/wordml/cid" xmlns:w16="http://schemas.microsoft.com/office/word/2018/wordml" xmlns:w16du="http://schemas.microsoft.com/office/word/2023/wordml/word16du" xmlns:w16sdtdh="http://schemas.microsoft.com/office/word/2020/wordml/sdtdatahash" xmlns:w16sdtfl="http://schemas.microsoft.com/office/word/2024/wordml/sdtformatlock" xmlns:w16se="http://schemas.microsoft.com/office/word/2015/wordml/symex" xmlns:wpg="http://schemas.microsoft.com/office/word/2010/wordprocessingGroup" xmlns:wpi="http://schemas.microsoft.com/office/word/2010/wordprocessingInk" xmlns:wne="http://schemas.microsoft.com/office/word/2006/wordml" xmlns:wps="http://schemas.microsoft.com/office/word/2010/wordprocessingShape" mc:Ignorable="w14 w15 w16se w16cid w16 w16cex w16sdtdh w16sdtfl w16du wp14">
   <w:body>
     <w:p>
+      <w:pPr>
+        <w:rPr>
+          <w:b/>
+          <w:bCs/>
+        </w:rPr>
+      </w:pPr>
       <w:r>
         <w:rPr>
-          <w:rFonts w:hint="eastAsia"/>
-        </w:rPr>
-        <w:t>产品信息</w:t>
+          <w:b/>
+          <w:bCs/>
+        </w:rPr>
+        <w:t>1. 顶部核心区 (Header &amp; Quick Summary)</w:t>
       </w:r>
     </w:p>
     <w:p>
+      <w:pPr>
+        <w:rPr>
+          <w:b/>
+          <w:bCs/>
+        </w:rPr>
+      </w:pPr>
       <w:r>
-        <w:t>Aluminum Double-Sided Mouse Pad</w:t>
+        <w:rPr>
+          <w:b/>
+          <w:bCs/>
+        </w:rPr>
+        <w:t>专业级铝合金鼠标垫 B2B 商务礼品首选 | 极简、坚固、易打理</w:t>
       </w:r>
     </w:p>
     <w:p>
+      <w:pPr>
+        <w:rPr>
+          <w:b/>
+          <w:bCs/>
+        </w:rPr>
+      </w:pPr>
       <w:r>
-        <w:t>Crafted from aircraft-grade aluminum with a sandblasted anodized finish for a smooth, durable feel. High-gloss chamfered edges ensure comfort.</w:t>
+        <w:rPr>
+          <w:b/>
+          <w:bCs/>
+        </w:rPr>
+        <w:t>为现代办公环境设计的金属基准工具。以耐用的铝合金结构替代易损耗的传统布垫，提供更专业、更整洁的桌面体验。</w:t>
       </w:r>
     </w:p>
     <w:p>
+      <w:pPr>
+        <w:numPr>
+          <w:ilvl w:val="0"/>
+          <w:numId w:val="17"/>
+        </w:numPr>
+        <w:rPr>
+          <w:b/>
+          <w:bCs/>
+        </w:rPr>
+      </w:pPr>
       <w:r>
-        <w:t>Dual-sided design for versatility:</w:t>
+        <w:rPr>
+          <w:b/>
+          <w:bCs/>
+        </w:rPr>
+        <w:t>CNC 平滑边缘： 侧边经精密加工，边缘平整圆润，确保长时间使用的舒适度。</w:t>
       </w:r>
     </w:p>
     <w:p>
+      <w:pPr>
+        <w:numPr>
+          <w:ilvl w:val="0"/>
+          <w:numId w:val="17"/>
+        </w:numPr>
+        <w:rPr>
+          <w:b/>
+          <w:bCs/>
+        </w:rPr>
+      </w:pPr>
       <w:r>
-        <w:t>Aluminum side: Smooth and precise, ideal for office, design, and gaming.</w:t>
+        <w:rPr>
+          <w:b/>
+          <w:bCs/>
+        </w:rPr>
+        <w:t>实用双面设计： 5052 铝合金面板提供清爽的操控感；PU 皮革背面确保稳固防滑。</w:t>
       </w:r>
     </w:p>
     <w:p>
+      <w:pPr>
+        <w:numPr>
+          <w:ilvl w:val="0"/>
+          <w:numId w:val="17"/>
+        </w:numPr>
+        <w:rPr>
+          <w:b/>
+          <w:bCs/>
+        </w:rPr>
+      </w:pPr>
       <w:r>
-        <w:t>PU leather side: Quiet and comfortable, reducing friction for daily use.</w:t>
+        <w:rPr>
+          <w:b/>
+          <w:bCs/>
+        </w:rPr>
+        <w:t>长效耐用： 2.5mm 结构，不翘边、不吸汗、易擦拭，专为高频使用场景设计。</w:t>
       </w:r>
     </w:p>
     <w:p>
+      <w:pPr>
+        <w:rPr>
+          <w:b/>
+          <w:bCs/>
+        </w:rPr>
+      </w:pPr>
       <w:r>
-        <w:t>Non-slip silicone base keeps it firmly in place. Available in multiple sizes with a minimalist design to fit any desk. Supports custom logo engraving – perfect for offices, home use, and gifts.</w:t>
-      </w:r>
-    </w:p>
-    <w:p/>
-    <w:p/>
-    <w:p>
-      <w:r>
-        <w:rPr>
-          <w:rFonts w:hint="eastAsia"/>
-        </w:rPr>
-        <w:t>文案</w:t>
-      </w:r>
-    </w:p>
-    <w:p>
-      <w:r>
-        <w:t>Aluminum Double-Sided Mouse Pad: Minimalist Aesthetics, Precision Control, and Desktop Elegance</w:t>
-      </w:r>
-    </w:p>
-    <w:p>
-      <w:r>
-        <w:t>Crafted from premium aircraft-grade aluminum, this mouse pad is precision-stamped in a single piece. Its surface undergoes fine sandblasting and anodization, resulting in a luxuriously smooth and durable finish. The edges are chamfered to a high-gloss, ensuring a soft, comfortable feel that won't scratch your wrists. Free from unnecessary decorations, its minimalist solid-color design seamlessly complements any desktop style.</w:t>
-      </w:r>
-    </w:p>
-    <w:p>
-      <w:r>
-        <w:t>Featuring a dual-sided design, this mouse pad offers two distinct experiences in one:</w:t>
-      </w:r>
-    </w:p>
-    <w:p>
-      <w:r>
-        <w:t>The aluminum side provides uniform resistance, enabling smooth and stable mouse movement with pinpoint accuracy. It is ideal for office work, graphic design, and competitive gaming, where precision is paramount.</w:t>
-      </w:r>
-    </w:p>
-    <w:p>
-      <w:r>
-        <w:t>The PU leather side offers a quiet, soft touch that reduces friction, making it perfect for extended daily use and casual computing, enhancing comfort during long sessions.</w:t>
-      </w:r>
-    </w:p>
-    <w:p>
-      <w:r>
-        <w:t>The bottom is equipped with a non-slip silicone layer that grips the desktop firmly, preventing unwanted movement even during intense operation. Available in multiple sizes to suit different space requirements, it is compatible with laptops and desktops alike. It also supports custom logo engraving, making it a versatile choice for professional offices, home setups, and corporate gifts. This is not just a tool for enhanced control, but a minimalist statement piece that elevates any workspace.</w:t>
-      </w:r>
-    </w:p>
-    <w:p/>
-    <w:p/>
-    <w:p>
-      <w:r>
-        <w:t>Here is the English translation for your product specifications, optimized for a professional catalog or e-commerce listing.</w:t>
-      </w:r>
-    </w:p>
-    <w:p>
-      <w:r>
-        <w:pict w14:anchorId="35C4B1D5">
-          <v:rect id="_x0000_i1035" style="width:0;height:1.5pt" o:hralign="center" o:hrstd="t" o:hr="t" fillcolor="#a0a0a0" stroked="f"/>
+        <w:rPr>
+          <w:b/>
+          <w:bCs/>
+        </w:rPr>
+        <w:pict w14:anchorId="1DB9DEFF">
+          <v:rect id="_x0000_i1157" style="width:0;height:1.5pt" o:hralign="center" o:hrstd="t" o:hr="t" fillcolor="#a0a0a0" stroked="f"/>
         </w:pict>
       </w:r>
     </w:p>
@@ -106,7 +133,7 @@
           <w:b/>
           <w:bCs/>
         </w:rPr>
-        <w:t>Aluminum Alloy Mouse Pad</w:t>
+        <w:t>2. 叙事描述 (The Narrative)</w:t>
       </w:r>
     </w:p>
     <w:p>
@@ -121,104 +148,81 @@
           <w:b/>
           <w:bCs/>
         </w:rPr>
-        <w:t>Specifications</w:t>
+        <w:t>更整洁、更专业的办公选择。 在快节奏的办公环境中，可靠的工具能显著提升效率。这款铝合金鼠标垫采用了成熟的工业加工工艺，从 5052 铝板中精确切削而成，彻底解决了传统鼠标垫容易起皮、脏污且难以清洁的问题。</w:t>
       </w:r>
     </w:p>
     <w:p>
       <w:pPr>
-        <w:numPr>
-          <w:ilvl w:val="0"/>
-          <w:numId w:val="1"/>
-        </w:numPr>
+        <w:rPr>
+          <w:b/>
+          <w:bCs/>
+        </w:rPr>
       </w:pPr>
       <w:r>
         <w:rPr>
           <w:b/>
           <w:bCs/>
         </w:rPr>
-        <w:t>Materials:</w:t>
-      </w:r>
-      <w:r>
-        <w:t xml:space="preserve"> Aluminum alloy surface + Resin anti-slip surface + Silicone anti-slip base layer</w:t>
+        <w:t>通过喷砂与阳极氧化处理，表面呈现出细腻的哑光金属质感，能与现代笔记本电脑完美匹配。侧边的抛光处理在提升视觉层次感的同时，确保了手感的顺滑。这是一款实用的桌面基本件，它通过材质的升级，在保持极高性价比的同时，为企业礼品方案增添了明显的工业现代感。</w:t>
       </w:r>
     </w:p>
     <w:p>
       <w:pPr>
-        <w:numPr>
-          <w:ilvl w:val="0"/>
-          <w:numId w:val="1"/>
-        </w:numPr>
+        <w:rPr>
+          <w:b/>
+          <w:bCs/>
+        </w:rPr>
       </w:pPr>
       <w:r>
         <w:rPr>
           <w:b/>
           <w:bCs/>
         </w:rPr>
-        <w:t>Craftsmanship:</w:t>
-      </w:r>
-      <w:r>
-        <w:t xml:space="preserve"> Metal stamping, Sandblasted anodic oxidation, CNC diamond-cut edges (High-gloss chamfering)</w:t>
+        <w:pict w14:anchorId="7EAC9DBF">
+          <v:rect id="_x0000_i1158" style="width:0;height:1.5pt" o:hralign="center" o:hrstd="t" o:hr="t" fillcolor="#a0a0a0" stroked="f"/>
+        </w:pict>
       </w:r>
     </w:p>
     <w:p>
       <w:pPr>
-        <w:numPr>
-          <w:ilvl w:val="0"/>
-          <w:numId w:val="1"/>
-        </w:numPr>
+        <w:rPr>
+          <w:b/>
+          <w:bCs/>
+        </w:rPr>
       </w:pPr>
       <w:r>
         <w:rPr>
           <w:b/>
           <w:bCs/>
         </w:rPr>
-        <w:t>Structure:</w:t>
-      </w:r>
-      <w:r>
-        <w:t xml:space="preserve"> </w:t>
-      </w:r>
-      <w:r>
-        <w:rPr>
-          <w:b/>
-          <w:bCs/>
-        </w:rPr>
-        <w:t>Dual-sided design</w:t>
-      </w:r>
-      <w:r>
-        <w:t xml:space="preserve"> * </w:t>
-      </w:r>
-      <w:r>
-        <w:rPr>
-          <w:i/>
-          <w:iCs/>
-        </w:rPr>
-        <w:t>Metal side:</w:t>
-      </w:r>
-      <w:r>
-        <w:t xml:space="preserve"> Smooth and precise tracking</w:t>
+        <w:t>3. 技术规格 (Specifications)</w:t>
       </w:r>
     </w:p>
     <w:p>
       <w:pPr>
         <w:numPr>
-          <w:ilvl w:val="1"/>
-          <w:numId w:val="1"/>
+          <w:ilvl w:val="0"/>
+          <w:numId w:val="18"/>
         </w:numPr>
+        <w:rPr>
+          <w:b/>
+          <w:bCs/>
+        </w:rPr>
       </w:pPr>
       <w:r>
         <w:rPr>
-          <w:i/>
-          <w:iCs/>
-        </w:rPr>
-        <w:lastRenderedPageBreak/>
-        <w:t>Resin side:</w:t>
-      </w:r>
-      <w:r>
-        <w:t xml:space="preserve"> Quiet and comfortable feel</w:t>
+          <w:b/>
+          <w:bCs/>
+        </w:rPr>
+        <w:t>材质： 5052 系列铝合金 (正面) + 优质防滑 PU 皮革 (背面)</w:t>
       </w:r>
     </w:p>
     <w:p>
       <w:pPr>
+        <w:numPr>
+          <w:ilvl w:val="0"/>
+          <w:numId w:val="18"/>
+        </w:numPr>
         <w:rPr>
           <w:b/>
           <w:bCs/>
@@ -229,342 +233,683 @@
           <w:b/>
           <w:bCs/>
         </w:rPr>
-        <w:t>Dimensions</w:t>
-      </w:r>
-    </w:p>
-    <w:tbl>
-      <w:tblPr>
-        <w:tblW w:w="0" w:type="auto"/>
-        <w:tblCellSpacing w:w="15" w:type="dxa"/>
-        <w:tblCellMar>
-          <w:top w:w="15" w:type="dxa"/>
-          <w:left w:w="15" w:type="dxa"/>
-          <w:bottom w:w="15" w:type="dxa"/>
-          <w:right w:w="15" w:type="dxa"/>
-        </w:tblCellMar>
-        <w:tblLook w:val="04A0" w:firstRow="1" w:lastRow="0" w:firstColumn="1" w:lastColumn="0" w:noHBand="0" w:noVBand="1"/>
-      </w:tblPr>
-      <w:tblGrid>
-        <w:gridCol w:w="901"/>
-        <w:gridCol w:w="1510"/>
-      </w:tblGrid>
-      <w:tr>
-        <w:trPr>
-          <w:tblHeader/>
-          <w:tblCellSpacing w:w="15" w:type="dxa"/>
-        </w:trPr>
-        <w:tc>
-          <w:tcPr>
-            <w:tcW w:w="0" w:type="auto"/>
-            <w:tcBorders>
-              <w:top w:val="single" w:sz="6" w:space="0" w:color="auto"/>
-              <w:left w:val="single" w:sz="6" w:space="0" w:color="auto"/>
-              <w:bottom w:val="single" w:sz="6" w:space="0" w:color="auto"/>
-              <w:right w:val="single" w:sz="6" w:space="0" w:color="auto"/>
-            </w:tcBorders>
-            <w:vAlign w:val="center"/>
-            <w:hideMark/>
-          </w:tcPr>
-          <w:p>
-            <w:r>
-              <w:rPr>
-                <w:b/>
-                <w:bCs/>
-              </w:rPr>
-              <w:t>Size</w:t>
-            </w:r>
-          </w:p>
-        </w:tc>
-        <w:tc>
-          <w:tcPr>
-            <w:tcW w:w="0" w:type="auto"/>
-            <w:tcBorders>
-              <w:top w:val="single" w:sz="6" w:space="0" w:color="auto"/>
-              <w:left w:val="single" w:sz="6" w:space="0" w:color="auto"/>
-              <w:bottom w:val="single" w:sz="6" w:space="0" w:color="auto"/>
-              <w:right w:val="single" w:sz="6" w:space="0" w:color="auto"/>
-            </w:tcBorders>
-            <w:vAlign w:val="center"/>
-            <w:hideMark/>
-          </w:tcPr>
-          <w:p>
-            <w:r>
-              <w:rPr>
-                <w:b/>
-                <w:bCs/>
-              </w:rPr>
-              <w:t>Measurements</w:t>
-            </w:r>
-          </w:p>
-        </w:tc>
-      </w:tr>
-      <w:tr>
-        <w:trPr>
-          <w:tblCellSpacing w:w="15" w:type="dxa"/>
-        </w:trPr>
-        <w:tc>
-          <w:tcPr>
-            <w:tcW w:w="0" w:type="auto"/>
-            <w:tcBorders>
-              <w:top w:val="single" w:sz="6" w:space="0" w:color="auto"/>
-              <w:left w:val="single" w:sz="6" w:space="0" w:color="auto"/>
-              <w:bottom w:val="single" w:sz="6" w:space="0" w:color="auto"/>
-              <w:right w:val="single" w:sz="6" w:space="0" w:color="auto"/>
-            </w:tcBorders>
-            <w:vAlign w:val="center"/>
-            <w:hideMark/>
-          </w:tcPr>
-          <w:p>
-            <w:r>
-              <w:rPr>
-                <w:b/>
-                <w:bCs/>
-              </w:rPr>
-              <w:t>Mini</w:t>
-            </w:r>
-          </w:p>
-        </w:tc>
-        <w:tc>
-          <w:tcPr>
-            <w:tcW w:w="0" w:type="auto"/>
-            <w:tcBorders>
-              <w:top w:val="single" w:sz="6" w:space="0" w:color="auto"/>
-              <w:left w:val="single" w:sz="6" w:space="0" w:color="auto"/>
-              <w:bottom w:val="single" w:sz="6" w:space="0" w:color="auto"/>
-              <w:right w:val="single" w:sz="6" w:space="0" w:color="auto"/>
-            </w:tcBorders>
-            <w:vAlign w:val="center"/>
-            <w:hideMark/>
-          </w:tcPr>
-          <w:p>
-            <w:r>
-              <w:t>200 × 170 mm</w:t>
-            </w:r>
-          </w:p>
-        </w:tc>
-      </w:tr>
-      <w:tr>
-        <w:trPr>
-          <w:tblCellSpacing w:w="15" w:type="dxa"/>
-        </w:trPr>
-        <w:tc>
-          <w:tcPr>
-            <w:tcW w:w="0" w:type="auto"/>
-            <w:tcBorders>
-              <w:top w:val="single" w:sz="6" w:space="0" w:color="auto"/>
-              <w:left w:val="single" w:sz="6" w:space="0" w:color="auto"/>
-              <w:bottom w:val="single" w:sz="6" w:space="0" w:color="auto"/>
-              <w:right w:val="single" w:sz="6" w:space="0" w:color="auto"/>
-            </w:tcBorders>
-            <w:vAlign w:val="center"/>
-            <w:hideMark/>
-          </w:tcPr>
-          <w:p>
-            <w:r>
-              <w:rPr>
-                <w:b/>
-                <w:bCs/>
-              </w:rPr>
-              <w:t>Small</w:t>
-            </w:r>
-          </w:p>
-        </w:tc>
-        <w:tc>
-          <w:tcPr>
-            <w:tcW w:w="0" w:type="auto"/>
-            <w:tcBorders>
-              <w:top w:val="single" w:sz="6" w:space="0" w:color="auto"/>
-              <w:left w:val="single" w:sz="6" w:space="0" w:color="auto"/>
-              <w:bottom w:val="single" w:sz="6" w:space="0" w:color="auto"/>
-              <w:right w:val="single" w:sz="6" w:space="0" w:color="auto"/>
-            </w:tcBorders>
-            <w:vAlign w:val="center"/>
-            <w:hideMark/>
-          </w:tcPr>
-          <w:p>
-            <w:r>
-              <w:t>230 × 180 mm</w:t>
-            </w:r>
-          </w:p>
-        </w:tc>
-      </w:tr>
-      <w:tr>
-        <w:trPr>
-          <w:tblCellSpacing w:w="15" w:type="dxa"/>
-        </w:trPr>
-        <w:tc>
-          <w:tcPr>
-            <w:tcW w:w="0" w:type="auto"/>
-            <w:tcBorders>
-              <w:top w:val="single" w:sz="6" w:space="0" w:color="auto"/>
-              <w:left w:val="single" w:sz="6" w:space="0" w:color="auto"/>
-              <w:bottom w:val="single" w:sz="6" w:space="0" w:color="auto"/>
-              <w:right w:val="single" w:sz="6" w:space="0" w:color="auto"/>
-            </w:tcBorders>
-            <w:vAlign w:val="center"/>
-            <w:hideMark/>
-          </w:tcPr>
-          <w:p>
-            <w:r>
-              <w:rPr>
-                <w:b/>
-                <w:bCs/>
-              </w:rPr>
-              <w:t>Medium</w:t>
-            </w:r>
-          </w:p>
-        </w:tc>
-        <w:tc>
-          <w:tcPr>
-            <w:tcW w:w="0" w:type="auto"/>
-            <w:tcBorders>
-              <w:top w:val="single" w:sz="6" w:space="0" w:color="auto"/>
-              <w:left w:val="single" w:sz="6" w:space="0" w:color="auto"/>
-              <w:bottom w:val="single" w:sz="6" w:space="0" w:color="auto"/>
-              <w:right w:val="single" w:sz="6" w:space="0" w:color="auto"/>
-            </w:tcBorders>
-            <w:vAlign w:val="center"/>
-            <w:hideMark/>
-          </w:tcPr>
-          <w:p>
-            <w:r>
-              <w:t>240 × 200 mm</w:t>
-            </w:r>
-          </w:p>
-        </w:tc>
-      </w:tr>
-      <w:tr>
-        <w:trPr>
-          <w:tblCellSpacing w:w="15" w:type="dxa"/>
-        </w:trPr>
-        <w:tc>
-          <w:tcPr>
-            <w:tcW w:w="0" w:type="auto"/>
-            <w:tcBorders>
-              <w:top w:val="single" w:sz="6" w:space="0" w:color="auto"/>
-              <w:left w:val="single" w:sz="6" w:space="0" w:color="auto"/>
-              <w:bottom w:val="single" w:sz="6" w:space="0" w:color="auto"/>
-              <w:right w:val="single" w:sz="6" w:space="0" w:color="auto"/>
-            </w:tcBorders>
-            <w:vAlign w:val="center"/>
-            <w:hideMark/>
-          </w:tcPr>
-          <w:p>
-            <w:r>
-              <w:rPr>
-                <w:b/>
-                <w:bCs/>
-              </w:rPr>
-              <w:t>Large</w:t>
-            </w:r>
-          </w:p>
-        </w:tc>
-        <w:tc>
-          <w:tcPr>
-            <w:tcW w:w="0" w:type="auto"/>
-            <w:tcBorders>
-              <w:top w:val="single" w:sz="6" w:space="0" w:color="auto"/>
-              <w:left w:val="single" w:sz="6" w:space="0" w:color="auto"/>
-              <w:bottom w:val="single" w:sz="6" w:space="0" w:color="auto"/>
-              <w:right w:val="single" w:sz="6" w:space="0" w:color="auto"/>
-            </w:tcBorders>
-            <w:vAlign w:val="center"/>
-            <w:hideMark/>
-          </w:tcPr>
-          <w:p>
-            <w:r>
-              <w:t>300 × 240 mm</w:t>
-            </w:r>
-          </w:p>
-        </w:tc>
-      </w:tr>
-    </w:tbl>
-    <w:p>
-      <w:pPr>
-        <w:rPr>
-          <w:b/>
-          <w:bCs/>
-        </w:rPr>
-      </w:pPr>
-      <w:r>
-        <w:rPr>
-          <w:b/>
-          <w:bCs/>
-        </w:rPr>
-        <w:t>Key Features</w:t>
+        <w:t>工艺： 边缘 CNC 倒角 + 表面喷砂 + 阳极氧化</w:t>
       </w:r>
     </w:p>
     <w:p>
       <w:pPr>
         <w:numPr>
           <w:ilvl w:val="0"/>
-          <w:numId w:val="2"/>
+          <w:numId w:val="18"/>
         </w:numPr>
+        <w:rPr>
+          <w:b/>
+          <w:bCs/>
+        </w:rPr>
       </w:pPr>
       <w:r>
         <w:rPr>
           <w:b/>
           <w:bCs/>
         </w:rPr>
-        <w:t>Stable &amp; Anti-slip:</w:t>
-      </w:r>
-      <w:r>
-        <w:t xml:space="preserve"> Multi-layer construction ensures it stays in place during intense use.</w:t>
+        <w:t>厚度： 2.5mm (极薄平整，减少手腕负担)</w:t>
       </w:r>
     </w:p>
     <w:p>
       <w:pPr>
         <w:numPr>
           <w:ilvl w:val="0"/>
-          <w:numId w:val="2"/>
+          <w:numId w:val="18"/>
         </w:numPr>
+        <w:rPr>
+          <w:b/>
+          <w:bCs/>
+        </w:rPr>
       </w:pPr>
       <w:r>
         <w:rPr>
           <w:b/>
           <w:bCs/>
         </w:rPr>
-        <w:t>Durable &amp; Wear-resistant:</w:t>
-      </w:r>
-      <w:r>
-        <w:t xml:space="preserve"> Built to withstand long-term friction without degrading.</w:t>
+        <w:t>重量： 约 320g (扎实的下沉感，防止滑动)</w:t>
       </w:r>
     </w:p>
     <w:p>
       <w:pPr>
         <w:numPr>
           <w:ilvl w:val="0"/>
-          <w:numId w:val="2"/>
+          <w:numId w:val="18"/>
         </w:numPr>
+        <w:rPr>
+          <w:b/>
+          <w:bCs/>
+        </w:rPr>
       </w:pPr>
       <w:r>
         <w:rPr>
           <w:b/>
           <w:bCs/>
         </w:rPr>
-        <w:t>Customizable:</w:t>
-      </w:r>
-      <w:r>
-        <w:t xml:space="preserve"> Supports </w:t>
-      </w:r>
-      <w:r>
-        <w:rPr>
-          <w:b/>
-          <w:bCs/>
-        </w:rPr>
-        <w:t>custom LOGO</w:t>
-      </w:r>
-      <w:r>
-        <w:t xml:space="preserve"> engraving/printing.</w:t>
+        <w:t>颜色： 矿石银 (Stone Silver) / 陨石黑 (Meteorite Black)</w:t>
       </w:r>
     </w:p>
     <w:p>
       <w:pPr>
         <w:rPr>
-          <w:rFonts w:hint="eastAsia"/>
-        </w:rPr>
-      </w:pPr>
+          <w:b/>
+          <w:bCs/>
+        </w:rPr>
+      </w:pPr>
+      <w:r>
+        <w:rPr>
+          <w:b/>
+          <w:bCs/>
+        </w:rPr>
+        <w:pict w14:anchorId="3F2CA2AC">
+          <v:rect id="_x0000_i1159" style="width:0;height:1.5pt" o:hralign="center" o:hrstd="t" o:hr="t" fillcolor="#a0a0a0" stroked="f"/>
+        </w:pict>
+      </w:r>
     </w:p>
+    <w:p>
+      <w:pPr>
+        <w:rPr>
+          <w:b/>
+          <w:bCs/>
+        </w:rPr>
+      </w:pPr>
+      <w:r>
+        <w:rPr>
+          <w:b/>
+          <w:bCs/>
+        </w:rPr>
+        <w:t>4. 常见问题解答 (FAQ)</w:t>
+      </w:r>
+    </w:p>
+    <w:p>
+      <w:pPr>
+        <w:numPr>
+          <w:ilvl w:val="0"/>
+          <w:numId w:val="19"/>
+        </w:numPr>
+        <w:rPr>
+          <w:b/>
+          <w:bCs/>
+        </w:rPr>
+      </w:pPr>
+      <w:r>
+        <w:rPr>
+          <w:b/>
+          <w:bCs/>
+        </w:rPr>
+        <w:t>Q: 它的耐用性如何？</w:t>
+      </w:r>
+    </w:p>
+    <w:p>
+      <w:pPr>
+        <w:numPr>
+          <w:ilvl w:val="1"/>
+          <w:numId w:val="19"/>
+        </w:numPr>
+        <w:rPr>
+          <w:b/>
+          <w:bCs/>
+        </w:rPr>
+      </w:pPr>
+      <w:r>
+        <w:rPr>
+          <w:b/>
+          <w:bCs/>
+        </w:rPr>
+        <w:t>A: 铝合金材质赋予了它极高的物理强度，不会像布垫那样随时间推移而磨损或变形。它是典型的“一次投入，长期使用”的办公工具。</w:t>
+      </w:r>
+    </w:p>
+    <w:p>
+      <w:pPr>
+        <w:numPr>
+          <w:ilvl w:val="0"/>
+          <w:numId w:val="19"/>
+        </w:numPr>
+        <w:rPr>
+          <w:b/>
+          <w:bCs/>
+        </w:rPr>
+      </w:pPr>
+      <w:r>
+        <w:rPr>
+          <w:b/>
+          <w:bCs/>
+        </w:rPr>
+        <w:t>Q: 表面容易清理吗？</w:t>
+      </w:r>
+    </w:p>
+    <w:p>
+      <w:pPr>
+        <w:numPr>
+          <w:ilvl w:val="1"/>
+          <w:numId w:val="19"/>
+        </w:numPr>
+        <w:rPr>
+          <w:b/>
+          <w:bCs/>
+        </w:rPr>
+      </w:pPr>
+      <w:r>
+        <w:rPr>
+          <w:b/>
+          <w:bCs/>
+        </w:rPr>
+        <w:t>A: 是的。由于阳极氧化层的存在，茶渍或灰尘只需用湿布轻轻一擦即可恢复如新，非常适合保持办公桌面的整洁感。</w:t>
+      </w:r>
+    </w:p>
+    <w:p>
+      <w:pPr>
+        <w:numPr>
+          <w:ilvl w:val="0"/>
+          <w:numId w:val="19"/>
+        </w:numPr>
+        <w:rPr>
+          <w:b/>
+          <w:bCs/>
+        </w:rPr>
+      </w:pPr>
+      <w:r>
+        <w:rPr>
+          <w:b/>
+          <w:bCs/>
+        </w:rPr>
+        <w:t>Q: Logo 定制效果如何？</w:t>
+      </w:r>
+    </w:p>
+    <w:p>
+      <w:pPr>
+        <w:numPr>
+          <w:ilvl w:val="1"/>
+          <w:numId w:val="19"/>
+        </w:numPr>
+        <w:rPr>
+          <w:b/>
+          <w:bCs/>
+        </w:rPr>
+      </w:pPr>
+      <w:r>
+        <w:rPr>
+          <w:b/>
+          <w:bCs/>
+        </w:rPr>
+        <w:t>A: 我们推荐使用激光刻蚀。Logo 会呈现出整洁的银白色金属原色，与磨砂表面形成微妙的对比。这种方式既低调又具有极高的品质感。</w:t>
+      </w:r>
+    </w:p>
+    <w:p>
+      <w:pPr>
+        <w:rPr>
+          <w:b/>
+          <w:bCs/>
+        </w:rPr>
+      </w:pPr>
+      <w:r>
+        <w:rPr>
+          <w:b/>
+          <w:bCs/>
+        </w:rPr>
+        <w:pict w14:anchorId="2E6964BF">
+          <v:rect id="_x0000_i1160" style="width:0;height:1.5pt" o:hralign="center" o:hrstd="t" o:hr="t" fillcolor="#a0a0a0" stroked="f"/>
+        </w:pict>
+      </w:r>
+    </w:p>
+    <w:p>
+      <w:pPr>
+        <w:rPr>
+          <w:b/>
+          <w:bCs/>
+        </w:rPr>
+      </w:pPr>
+      <w:r>
+        <w:rPr>
+          <w:b/>
+          <w:bCs/>
+        </w:rPr>
+        <w:t>## 全英文版本 (Professional &amp; Pragmatic Version)</w:t>
+      </w:r>
+    </w:p>
+    <w:p>
+      <w:pPr>
+        <w:rPr>
+          <w:b/>
+          <w:bCs/>
+        </w:rPr>
+      </w:pPr>
+      <w:r>
+        <w:rPr>
+          <w:b/>
+          <w:bCs/>
+        </w:rPr>
+        <w:t>Professional Aluminum Mouse Pad</w:t>
+      </w:r>
+    </w:p>
+    <w:p>
+      <w:pPr>
+        <w:rPr>
+          <w:b/>
+          <w:bCs/>
+        </w:rPr>
+      </w:pPr>
+      <w:r>
+        <w:rPr>
+          <w:b/>
+          <w:bCs/>
+        </w:rPr>
+        <w:t>Ideal for B2B Corporate Gifting | Minimalist, Durable, Easy-to-Clean</w:t>
+      </w:r>
+    </w:p>
+    <w:p>
+      <w:pPr>
+        <w:rPr>
+          <w:b/>
+          <w:bCs/>
+        </w:rPr>
+      </w:pPr>
+      <w:r>
+        <w:rPr>
+          <w:b/>
+          <w:bCs/>
+        </w:rPr>
+        <w:t>A solid metal foundation for the modern workspace. Replace disposable cloth pads with a durable aluminum structure that offers a cleaner, more professional desktop experience.</w:t>
+      </w:r>
+    </w:p>
+    <w:p>
+      <w:pPr>
+        <w:numPr>
+          <w:ilvl w:val="0"/>
+          <w:numId w:val="20"/>
+        </w:numPr>
+        <w:rPr>
+          <w:b/>
+          <w:bCs/>
+        </w:rPr>
+      </w:pPr>
+      <w:r>
+        <w:rPr>
+          <w:b/>
+          <w:bCs/>
+        </w:rPr>
+        <w:t>CNC Smooth Chamfer: Machined edges ensure a flat, burr-free finish for long-term comfort.</w:t>
+      </w:r>
+    </w:p>
+    <w:p>
+      <w:pPr>
+        <w:numPr>
+          <w:ilvl w:val="0"/>
+          <w:numId w:val="20"/>
+        </w:numPr>
+        <w:rPr>
+          <w:b/>
+          <w:bCs/>
+        </w:rPr>
+      </w:pPr>
+      <w:r>
+        <w:rPr>
+          <w:b/>
+          <w:bCs/>
+        </w:rPr>
+        <w:t>Practical Dual-Sided Design: Anodized 5052 aluminum for precision; non-slip PU leather for stability.</w:t>
+      </w:r>
+    </w:p>
+    <w:p>
+      <w:pPr>
+        <w:numPr>
+          <w:ilvl w:val="0"/>
+          <w:numId w:val="20"/>
+        </w:numPr>
+        <w:rPr>
+          <w:b/>
+          <w:bCs/>
+        </w:rPr>
+      </w:pPr>
+      <w:r>
+        <w:rPr>
+          <w:b/>
+          <w:bCs/>
+        </w:rPr>
+        <w:lastRenderedPageBreak/>
+        <w:t>Built to Last: 2.5mm profile—no warping, no fraying, and sweat-resistant. Designed for high-frequency use.</w:t>
+      </w:r>
+    </w:p>
+    <w:p>
+      <w:pPr>
+        <w:rPr>
+          <w:b/>
+          <w:bCs/>
+        </w:rPr>
+      </w:pPr>
+      <w:r>
+        <w:rPr>
+          <w:b/>
+          <w:bCs/>
+        </w:rPr>
+        <w:pict w14:anchorId="1C4AB913">
+          <v:rect id="_x0000_i1161" style="width:0;height:1.5pt" o:hralign="center" o:hrstd="t" o:hr="t" fillcolor="#a0a0a0" stroked="f"/>
+        </w:pict>
+      </w:r>
+    </w:p>
+    <w:p>
+      <w:pPr>
+        <w:rPr>
+          <w:b/>
+          <w:bCs/>
+        </w:rPr>
+      </w:pPr>
+      <w:r>
+        <w:rPr>
+          <w:b/>
+          <w:bCs/>
+        </w:rPr>
+        <w:t>## The Narrative</w:t>
+      </w:r>
+    </w:p>
+    <w:p>
+      <w:pPr>
+        <w:rPr>
+          <w:b/>
+          <w:bCs/>
+        </w:rPr>
+      </w:pPr>
+      <w:r>
+        <w:rPr>
+          <w:b/>
+          <w:bCs/>
+        </w:rPr>
+        <w:t>A Cleaner, More Professional Setup. In a high-paced office environment, reliability is key. This aluminum mouse pad is built with proven industrial processes, machined from 5052 aluminum plates to eliminate the common issues of fraying and staining found in traditional pads.</w:t>
+      </w:r>
+    </w:p>
+    <w:p>
+      <w:pPr>
+        <w:rPr>
+          <w:b/>
+          <w:bCs/>
+        </w:rPr>
+      </w:pPr>
+      <w:r>
+        <w:rPr>
+          <w:b/>
+          <w:bCs/>
+        </w:rPr>
+        <w:t>Featuring a sandblasted and anodized finish, the surface provides a fine matte texture that complements modern laptops. The polished edges provide a clean visual accent while ensuring a smooth tactile experience. This is a practical desktop essential that upgrades the "standard" through better materials, offering a high-perceived value for corporate gift programs without the premium price tag.</w:t>
+      </w:r>
+    </w:p>
+    <w:p>
+      <w:pPr>
+        <w:rPr>
+          <w:b/>
+          <w:bCs/>
+        </w:rPr>
+      </w:pPr>
+      <w:r>
+        <w:rPr>
+          <w:b/>
+          <w:bCs/>
+        </w:rPr>
+        <w:pict w14:anchorId="79AABE87">
+          <v:rect id="_x0000_i1162" style="width:0;height:1.5pt" o:hralign="center" o:hrstd="t" o:hr="t" fillcolor="#a0a0a0" stroked="f"/>
+        </w:pict>
+      </w:r>
+    </w:p>
+    <w:p>
+      <w:pPr>
+        <w:rPr>
+          <w:b/>
+          <w:bCs/>
+        </w:rPr>
+      </w:pPr>
+      <w:r>
+        <w:rPr>
+          <w:b/>
+          <w:bCs/>
+        </w:rPr>
+        <w:t>## Specifications</w:t>
+      </w:r>
+    </w:p>
+    <w:p>
+      <w:pPr>
+        <w:numPr>
+          <w:ilvl w:val="0"/>
+          <w:numId w:val="21"/>
+        </w:numPr>
+        <w:rPr>
+          <w:b/>
+          <w:bCs/>
+        </w:rPr>
+      </w:pPr>
+      <w:r>
+        <w:rPr>
+          <w:b/>
+          <w:bCs/>
+        </w:rPr>
+        <w:t>Materials: 5052 Series Aluminum (Front) + Non-slip PU Leather (Back)</w:t>
+      </w:r>
+    </w:p>
+    <w:p>
+      <w:pPr>
+        <w:numPr>
+          <w:ilvl w:val="0"/>
+          <w:numId w:val="21"/>
+        </w:numPr>
+        <w:rPr>
+          <w:b/>
+          <w:bCs/>
+        </w:rPr>
+      </w:pPr>
+      <w:r>
+        <w:rPr>
+          <w:b/>
+          <w:bCs/>
+        </w:rPr>
+        <w:t>Craftsmanship: CNC Edge Chamfering + Sandblasting + Anodization</w:t>
+      </w:r>
+    </w:p>
+    <w:p>
+      <w:pPr>
+        <w:numPr>
+          <w:ilvl w:val="0"/>
+          <w:numId w:val="21"/>
+        </w:numPr>
+        <w:rPr>
+          <w:b/>
+          <w:bCs/>
+        </w:rPr>
+      </w:pPr>
+      <w:r>
+        <w:rPr>
+          <w:b/>
+          <w:bCs/>
+        </w:rPr>
+        <w:t>Thickness: 2.5mm (Ultra-slim to minimize wrist fatigue)</w:t>
+      </w:r>
+    </w:p>
+    <w:p>
+      <w:pPr>
+        <w:numPr>
+          <w:ilvl w:val="0"/>
+          <w:numId w:val="21"/>
+        </w:numPr>
+        <w:rPr>
+          <w:b/>
+          <w:bCs/>
+        </w:rPr>
+      </w:pPr>
+      <w:r>
+        <w:rPr>
+          <w:b/>
+          <w:bCs/>
+        </w:rPr>
+        <w:t>Weight: Approx. 11.3 oz (320g) (Provides a solid, planted feel)</w:t>
+      </w:r>
+    </w:p>
+    <w:p>
+      <w:pPr>
+        <w:numPr>
+          <w:ilvl w:val="0"/>
+          <w:numId w:val="21"/>
+        </w:numPr>
+        <w:rPr>
+          <w:b/>
+          <w:bCs/>
+        </w:rPr>
+      </w:pPr>
+      <w:r>
+        <w:rPr>
+          <w:b/>
+          <w:bCs/>
+        </w:rPr>
+        <w:t>Dimensions: 240mm x 200mm (Standard)</w:t>
+      </w:r>
+    </w:p>
+    <w:p>
+      <w:pPr>
+        <w:rPr>
+          <w:b/>
+          <w:bCs/>
+        </w:rPr>
+      </w:pPr>
+      <w:r>
+        <w:rPr>
+          <w:b/>
+          <w:bCs/>
+        </w:rPr>
+        <w:pict w14:anchorId="265C3CD4">
+          <v:rect id="_x0000_i1163" style="width:0;height:1.5pt" o:hralign="center" o:hrstd="t" o:hr="t" fillcolor="#a0a0a0" stroked="f"/>
+        </w:pict>
+      </w:r>
+    </w:p>
+    <w:p>
+      <w:pPr>
+        <w:rPr>
+          <w:b/>
+          <w:bCs/>
+        </w:rPr>
+      </w:pPr>
+      <w:r>
+        <w:rPr>
+          <w:b/>
+          <w:bCs/>
+        </w:rPr>
+        <w:t>## FAQ</w:t>
+      </w:r>
+    </w:p>
+    <w:p>
+      <w:pPr>
+        <w:numPr>
+          <w:ilvl w:val="0"/>
+          <w:numId w:val="22"/>
+        </w:numPr>
+        <w:rPr>
+          <w:b/>
+          <w:bCs/>
+        </w:rPr>
+      </w:pPr>
+      <w:r>
+        <w:rPr>
+          <w:b/>
+          <w:bCs/>
+        </w:rPr>
+        <w:t>Q: How durable is it for daily use?</w:t>
+      </w:r>
+    </w:p>
+    <w:p>
+      <w:pPr>
+        <w:numPr>
+          <w:ilvl w:val="1"/>
+          <w:numId w:val="22"/>
+        </w:numPr>
+        <w:rPr>
+          <w:b/>
+          <w:bCs/>
+        </w:rPr>
+      </w:pPr>
+      <w:r>
+        <w:rPr>
+          <w:b/>
+          <w:bCs/>
+        </w:rPr>
+        <w:t>A: The aluminum construction provides excellent physical strength. Unlike cloth pads, it won't wear down or deform over time. It is a true "one-time purchase" office tool.</w:t>
+      </w:r>
+    </w:p>
+    <w:p>
+      <w:pPr>
+        <w:numPr>
+          <w:ilvl w:val="0"/>
+          <w:numId w:val="22"/>
+        </w:numPr>
+        <w:rPr>
+          <w:b/>
+          <w:bCs/>
+        </w:rPr>
+      </w:pPr>
+      <w:r>
+        <w:rPr>
+          <w:b/>
+          <w:bCs/>
+        </w:rPr>
+        <w:t>Q: Is the surface easy to maintain?</w:t>
+      </w:r>
+    </w:p>
+    <w:p>
+      <w:pPr>
+        <w:numPr>
+          <w:ilvl w:val="1"/>
+          <w:numId w:val="22"/>
+        </w:numPr>
+        <w:rPr>
+          <w:b/>
+          <w:bCs/>
+        </w:rPr>
+      </w:pPr>
+      <w:r>
+        <w:rPr>
+          <w:b/>
+          <w:bCs/>
+        </w:rPr>
+        <w:t>A: Yes. The anodized layer is resistant to stains. Dust or liquid spills can be easily wiped away with a cloth, keeping your desktop looking pristine.</w:t>
+      </w:r>
+    </w:p>
+    <w:p>
+      <w:pPr>
+        <w:numPr>
+          <w:ilvl w:val="0"/>
+          <w:numId w:val="22"/>
+        </w:numPr>
+        <w:rPr>
+          <w:b/>
+          <w:bCs/>
+        </w:rPr>
+      </w:pPr>
+      <w:r>
+        <w:rPr>
+          <w:b/>
+          <w:bCs/>
+        </w:rPr>
+        <w:t>Q: What is the best way to add a corporate Logo?</w:t>
+      </w:r>
+    </w:p>
+    <w:p>
+      <w:pPr>
+        <w:numPr>
+          <w:ilvl w:val="1"/>
+          <w:numId w:val="22"/>
+        </w:numPr>
+        <w:rPr>
+          <w:b/>
+          <w:bCs/>
+        </w:rPr>
+      </w:pPr>
+      <w:r>
+        <w:rPr>
+          <w:b/>
+          <w:bCs/>
+        </w:rPr>
+        <w:t>A: We recommend Laser Etching. The logo appears in a clean, silver-white metallic tone, providing a subtle yet professional contrast against the matte surface.</w:t>
+      </w:r>
+    </w:p>
+    <w:p/>
     <w:sectPr>
       <w:pgSz w:w="11906" w:h="16838"/>
       <w:pgMar w:top="1440" w:right="1800" w:bottom="1440" w:left="1800" w:header="851" w:footer="992" w:gutter="0"/>
@@ -616,6 +961,1496 @@
 <file path=word/numbering.xml><?xml version="1.0" encoding="utf-8"?>
 <w:numbering xmlns:wpc="http://schemas.microsoft.com/office/word/2010/wordprocessingCanvas" xmlns:cx="http://schemas.microsoft.com/office/drawing/2014/chartex" xmlns:cx1="http://schemas.microsoft.com/office/drawing/2015/9/8/chartex" xmlns:cx2="http://schemas.microsoft.com/office/drawing/2015/10/21/chartex" xmlns:cx3="http://schemas.microsoft.com/office/drawing/2016/5/9/chartex" xmlns:cx4="http://schemas.microsoft.com/office/drawing/2016/5/10/chartex" xmlns:cx5="http://schemas.microsoft.com/office/drawing/2016/5/11/chartex" xmlns:cx6="http://schemas.microsoft.com/office/drawing/2016/5/12/chartex" xmlns:cx7="http://schemas.microsoft.com/office/drawing/2016/5/13/chartex" xmlns:cx8="http://schemas.microsoft.com/office/drawing/2016/5/14/chartex" xmlns:mc="http://schemas.openxmlformats.org/markup-compatibility/2006" xmlns:aink="http://schemas.microsoft.com/office/drawing/2016/ink" xmlns:am3d="http://schemas.microsoft.com/office/drawing/2017/model3d" xmlns:o="urn:schemas-microsoft-com:office:office" xmlns:oel="http://schemas.microsoft.com/office/2019/extlst" xmlns:r="http://schemas.openxmlformats.org/officeDocument/2006/relationships" xmlns:m="http://schemas.openxmlformats.org/officeDocument/2006/math" xmlns:v="urn:schemas-microsoft-com:vml" xmlns:wp14="http://schemas.microsoft.com/office/word/2010/wordprocessingDrawing" xmlns:wp="http://schemas.openxmlformats.org/drawingml/2006/wordprocessingDrawing" xmlns:w10="urn:schemas-microsoft-com:office:word" xmlns:w="http://schemas.openxmlformats.org/wordprocessingml/2006/main" xmlns:w14="http://schemas.microsoft.com/office/word/2010/wordml" xmlns:w15="http://schemas.microsoft.com/office/word/2012/wordml" xmlns:w16cex="http://schemas.microsoft.com/office/word/2018/wordml/cex" xmlns:w16cid="http://schemas.microsoft.com/office/word/2016/wordml/cid" xmlns:w16="http://schemas.microsoft.com/office/word/2018/wordml" xmlns:w16du="http://schemas.microsoft.com/office/word/2023/wordml/word16du" xmlns:w16sdtdh="http://schemas.microsoft.com/office/word/2020/wordml/sdtdatahash" xmlns:w16sdtfl="http://schemas.microsoft.com/office/word/2024/wordml/sdtformatlock" xmlns:w16se="http://schemas.microsoft.com/office/word/2015/wordml/symex" xmlns:wpg="http://schemas.microsoft.com/office/word/2010/wordprocessingGroup" xmlns:wpi="http://schemas.microsoft.com/office/word/2010/wordprocessingInk" xmlns:wne="http://schemas.microsoft.com/office/word/2006/wordml" xmlns:wps="http://schemas.microsoft.com/office/word/2010/wordprocessingShape" mc:Ignorable="w14 w15 w16se w16cid w16 w16cex w16sdtdh w16sdtfl w16du wp14">
   <w:abstractNum w:abstractNumId="0" w15:restartNumberingAfterBreak="0">
+    <w:nsid w:val="018F7576"/>
+    <w:multiLevelType w:val="multilevel"/>
+    <w:tmpl w:val="20CEEE40"/>
+    <w:lvl w:ilvl="0">
+      <w:start w:val="1"/>
+      <w:numFmt w:val="bullet"/>
+      <w:lvlText w:val=""/>
+      <w:lvlJc w:val="left"/>
+      <w:pPr>
+        <w:tabs>
+          <w:tab w:val="num" w:pos="720"/>
+        </w:tabs>
+        <w:ind w:left="720" w:hanging="360"/>
+      </w:pPr>
+      <w:rPr>
+        <w:rFonts w:ascii="Symbol" w:hAnsi="Symbol" w:hint="default"/>
+        <w:sz w:val="20"/>
+      </w:rPr>
+    </w:lvl>
+    <w:lvl w:ilvl="1">
+      <w:start w:val="1"/>
+      <w:numFmt w:val="bullet"/>
+      <w:lvlText w:val="o"/>
+      <w:lvlJc w:val="left"/>
+      <w:pPr>
+        <w:tabs>
+          <w:tab w:val="num" w:pos="1440"/>
+        </w:tabs>
+        <w:ind w:left="1440" w:hanging="360"/>
+      </w:pPr>
+      <w:rPr>
+        <w:rFonts w:ascii="Courier New" w:hAnsi="Courier New" w:hint="default"/>
+        <w:sz w:val="20"/>
+      </w:rPr>
+    </w:lvl>
+    <w:lvl w:ilvl="2" w:tentative="1">
+      <w:start w:val="1"/>
+      <w:numFmt w:val="bullet"/>
+      <w:lvlText w:val=""/>
+      <w:lvlJc w:val="left"/>
+      <w:pPr>
+        <w:tabs>
+          <w:tab w:val="num" w:pos="2160"/>
+        </w:tabs>
+        <w:ind w:left="2160" w:hanging="360"/>
+      </w:pPr>
+      <w:rPr>
+        <w:rFonts w:ascii="Wingdings" w:hAnsi="Wingdings" w:hint="default"/>
+        <w:sz w:val="20"/>
+      </w:rPr>
+    </w:lvl>
+    <w:lvl w:ilvl="3" w:tentative="1">
+      <w:start w:val="1"/>
+      <w:numFmt w:val="bullet"/>
+      <w:lvlText w:val=""/>
+      <w:lvlJc w:val="left"/>
+      <w:pPr>
+        <w:tabs>
+          <w:tab w:val="num" w:pos="2880"/>
+        </w:tabs>
+        <w:ind w:left="2880" w:hanging="360"/>
+      </w:pPr>
+      <w:rPr>
+        <w:rFonts w:ascii="Wingdings" w:hAnsi="Wingdings" w:hint="default"/>
+        <w:sz w:val="20"/>
+      </w:rPr>
+    </w:lvl>
+    <w:lvl w:ilvl="4" w:tentative="1">
+      <w:start w:val="1"/>
+      <w:numFmt w:val="bullet"/>
+      <w:lvlText w:val=""/>
+      <w:lvlJc w:val="left"/>
+      <w:pPr>
+        <w:tabs>
+          <w:tab w:val="num" w:pos="3600"/>
+        </w:tabs>
+        <w:ind w:left="3600" w:hanging="360"/>
+      </w:pPr>
+      <w:rPr>
+        <w:rFonts w:ascii="Wingdings" w:hAnsi="Wingdings" w:hint="default"/>
+        <w:sz w:val="20"/>
+      </w:rPr>
+    </w:lvl>
+    <w:lvl w:ilvl="5" w:tentative="1">
+      <w:start w:val="1"/>
+      <w:numFmt w:val="bullet"/>
+      <w:lvlText w:val=""/>
+      <w:lvlJc w:val="left"/>
+      <w:pPr>
+        <w:tabs>
+          <w:tab w:val="num" w:pos="4320"/>
+        </w:tabs>
+        <w:ind w:left="4320" w:hanging="360"/>
+      </w:pPr>
+      <w:rPr>
+        <w:rFonts w:ascii="Wingdings" w:hAnsi="Wingdings" w:hint="default"/>
+        <w:sz w:val="20"/>
+      </w:rPr>
+    </w:lvl>
+    <w:lvl w:ilvl="6" w:tentative="1">
+      <w:start w:val="1"/>
+      <w:numFmt w:val="bullet"/>
+      <w:lvlText w:val=""/>
+      <w:lvlJc w:val="left"/>
+      <w:pPr>
+        <w:tabs>
+          <w:tab w:val="num" w:pos="5040"/>
+        </w:tabs>
+        <w:ind w:left="5040" w:hanging="360"/>
+      </w:pPr>
+      <w:rPr>
+        <w:rFonts w:ascii="Wingdings" w:hAnsi="Wingdings" w:hint="default"/>
+        <w:sz w:val="20"/>
+      </w:rPr>
+    </w:lvl>
+    <w:lvl w:ilvl="7" w:tentative="1">
+      <w:start w:val="1"/>
+      <w:numFmt w:val="bullet"/>
+      <w:lvlText w:val=""/>
+      <w:lvlJc w:val="left"/>
+      <w:pPr>
+        <w:tabs>
+          <w:tab w:val="num" w:pos="5760"/>
+        </w:tabs>
+        <w:ind w:left="5760" w:hanging="360"/>
+      </w:pPr>
+      <w:rPr>
+        <w:rFonts w:ascii="Wingdings" w:hAnsi="Wingdings" w:hint="default"/>
+        <w:sz w:val="20"/>
+      </w:rPr>
+    </w:lvl>
+    <w:lvl w:ilvl="8" w:tentative="1">
+      <w:start w:val="1"/>
+      <w:numFmt w:val="bullet"/>
+      <w:lvlText w:val=""/>
+      <w:lvlJc w:val="left"/>
+      <w:pPr>
+        <w:tabs>
+          <w:tab w:val="num" w:pos="6480"/>
+        </w:tabs>
+        <w:ind w:left="6480" w:hanging="360"/>
+      </w:pPr>
+      <w:rPr>
+        <w:rFonts w:ascii="Wingdings" w:hAnsi="Wingdings" w:hint="default"/>
+        <w:sz w:val="20"/>
+      </w:rPr>
+    </w:lvl>
+  </w:abstractNum>
+  <w:abstractNum w:abstractNumId="1" w15:restartNumberingAfterBreak="0">
+    <w:nsid w:val="0E0B7F40"/>
+    <w:multiLevelType w:val="multilevel"/>
+    <w:tmpl w:val="17C2D42A"/>
+    <w:lvl w:ilvl="0">
+      <w:start w:val="1"/>
+      <w:numFmt w:val="bullet"/>
+      <w:lvlText w:val=""/>
+      <w:lvlJc w:val="left"/>
+      <w:pPr>
+        <w:tabs>
+          <w:tab w:val="num" w:pos="720"/>
+        </w:tabs>
+        <w:ind w:left="720" w:hanging="360"/>
+      </w:pPr>
+      <w:rPr>
+        <w:rFonts w:ascii="Symbol" w:hAnsi="Symbol" w:hint="default"/>
+        <w:sz w:val="20"/>
+      </w:rPr>
+    </w:lvl>
+    <w:lvl w:ilvl="1" w:tentative="1">
+      <w:start w:val="1"/>
+      <w:numFmt w:val="bullet"/>
+      <w:lvlText w:val="o"/>
+      <w:lvlJc w:val="left"/>
+      <w:pPr>
+        <w:tabs>
+          <w:tab w:val="num" w:pos="1440"/>
+        </w:tabs>
+        <w:ind w:left="1440" w:hanging="360"/>
+      </w:pPr>
+      <w:rPr>
+        <w:rFonts w:ascii="Courier New" w:hAnsi="Courier New" w:hint="default"/>
+        <w:sz w:val="20"/>
+      </w:rPr>
+    </w:lvl>
+    <w:lvl w:ilvl="2" w:tentative="1">
+      <w:start w:val="1"/>
+      <w:numFmt w:val="bullet"/>
+      <w:lvlText w:val=""/>
+      <w:lvlJc w:val="left"/>
+      <w:pPr>
+        <w:tabs>
+          <w:tab w:val="num" w:pos="2160"/>
+        </w:tabs>
+        <w:ind w:left="2160" w:hanging="360"/>
+      </w:pPr>
+      <w:rPr>
+        <w:rFonts w:ascii="Wingdings" w:hAnsi="Wingdings" w:hint="default"/>
+        <w:sz w:val="20"/>
+      </w:rPr>
+    </w:lvl>
+    <w:lvl w:ilvl="3" w:tentative="1">
+      <w:start w:val="1"/>
+      <w:numFmt w:val="bullet"/>
+      <w:lvlText w:val=""/>
+      <w:lvlJc w:val="left"/>
+      <w:pPr>
+        <w:tabs>
+          <w:tab w:val="num" w:pos="2880"/>
+        </w:tabs>
+        <w:ind w:left="2880" w:hanging="360"/>
+      </w:pPr>
+      <w:rPr>
+        <w:rFonts w:ascii="Wingdings" w:hAnsi="Wingdings" w:hint="default"/>
+        <w:sz w:val="20"/>
+      </w:rPr>
+    </w:lvl>
+    <w:lvl w:ilvl="4" w:tentative="1">
+      <w:start w:val="1"/>
+      <w:numFmt w:val="bullet"/>
+      <w:lvlText w:val=""/>
+      <w:lvlJc w:val="left"/>
+      <w:pPr>
+        <w:tabs>
+          <w:tab w:val="num" w:pos="3600"/>
+        </w:tabs>
+        <w:ind w:left="3600" w:hanging="360"/>
+      </w:pPr>
+      <w:rPr>
+        <w:rFonts w:ascii="Wingdings" w:hAnsi="Wingdings" w:hint="default"/>
+        <w:sz w:val="20"/>
+      </w:rPr>
+    </w:lvl>
+    <w:lvl w:ilvl="5" w:tentative="1">
+      <w:start w:val="1"/>
+      <w:numFmt w:val="bullet"/>
+      <w:lvlText w:val=""/>
+      <w:lvlJc w:val="left"/>
+      <w:pPr>
+        <w:tabs>
+          <w:tab w:val="num" w:pos="4320"/>
+        </w:tabs>
+        <w:ind w:left="4320" w:hanging="360"/>
+      </w:pPr>
+      <w:rPr>
+        <w:rFonts w:ascii="Wingdings" w:hAnsi="Wingdings" w:hint="default"/>
+        <w:sz w:val="20"/>
+      </w:rPr>
+    </w:lvl>
+    <w:lvl w:ilvl="6" w:tentative="1">
+      <w:start w:val="1"/>
+      <w:numFmt w:val="bullet"/>
+      <w:lvlText w:val=""/>
+      <w:lvlJc w:val="left"/>
+      <w:pPr>
+        <w:tabs>
+          <w:tab w:val="num" w:pos="5040"/>
+        </w:tabs>
+        <w:ind w:left="5040" w:hanging="360"/>
+      </w:pPr>
+      <w:rPr>
+        <w:rFonts w:ascii="Wingdings" w:hAnsi="Wingdings" w:hint="default"/>
+        <w:sz w:val="20"/>
+      </w:rPr>
+    </w:lvl>
+    <w:lvl w:ilvl="7" w:tentative="1">
+      <w:start w:val="1"/>
+      <w:numFmt w:val="bullet"/>
+      <w:lvlText w:val=""/>
+      <w:lvlJc w:val="left"/>
+      <w:pPr>
+        <w:tabs>
+          <w:tab w:val="num" w:pos="5760"/>
+        </w:tabs>
+        <w:ind w:left="5760" w:hanging="360"/>
+      </w:pPr>
+      <w:rPr>
+        <w:rFonts w:ascii="Wingdings" w:hAnsi="Wingdings" w:hint="default"/>
+        <w:sz w:val="20"/>
+      </w:rPr>
+    </w:lvl>
+    <w:lvl w:ilvl="8" w:tentative="1">
+      <w:start w:val="1"/>
+      <w:numFmt w:val="bullet"/>
+      <w:lvlText w:val=""/>
+      <w:lvlJc w:val="left"/>
+      <w:pPr>
+        <w:tabs>
+          <w:tab w:val="num" w:pos="6480"/>
+        </w:tabs>
+        <w:ind w:left="6480" w:hanging="360"/>
+      </w:pPr>
+      <w:rPr>
+        <w:rFonts w:ascii="Wingdings" w:hAnsi="Wingdings" w:hint="default"/>
+        <w:sz w:val="20"/>
+      </w:rPr>
+    </w:lvl>
+  </w:abstractNum>
+  <w:abstractNum w:abstractNumId="2" w15:restartNumberingAfterBreak="0">
+    <w:nsid w:val="0F4C0CB9"/>
+    <w:multiLevelType w:val="multilevel"/>
+    <w:tmpl w:val="7EE6E57A"/>
+    <w:lvl w:ilvl="0">
+      <w:start w:val="1"/>
+      <w:numFmt w:val="bullet"/>
+      <w:lvlText w:val=""/>
+      <w:lvlJc w:val="left"/>
+      <w:pPr>
+        <w:tabs>
+          <w:tab w:val="num" w:pos="720"/>
+        </w:tabs>
+        <w:ind w:left="720" w:hanging="360"/>
+      </w:pPr>
+      <w:rPr>
+        <w:rFonts w:ascii="Symbol" w:hAnsi="Symbol" w:hint="default"/>
+        <w:sz w:val="20"/>
+      </w:rPr>
+    </w:lvl>
+    <w:lvl w:ilvl="1">
+      <w:start w:val="1"/>
+      <w:numFmt w:val="bullet"/>
+      <w:lvlText w:val="o"/>
+      <w:lvlJc w:val="left"/>
+      <w:pPr>
+        <w:tabs>
+          <w:tab w:val="num" w:pos="1440"/>
+        </w:tabs>
+        <w:ind w:left="1440" w:hanging="360"/>
+      </w:pPr>
+      <w:rPr>
+        <w:rFonts w:ascii="Courier New" w:hAnsi="Courier New" w:hint="default"/>
+        <w:sz w:val="20"/>
+      </w:rPr>
+    </w:lvl>
+    <w:lvl w:ilvl="2" w:tentative="1">
+      <w:start w:val="1"/>
+      <w:numFmt w:val="bullet"/>
+      <w:lvlText w:val=""/>
+      <w:lvlJc w:val="left"/>
+      <w:pPr>
+        <w:tabs>
+          <w:tab w:val="num" w:pos="2160"/>
+        </w:tabs>
+        <w:ind w:left="2160" w:hanging="360"/>
+      </w:pPr>
+      <w:rPr>
+        <w:rFonts w:ascii="Wingdings" w:hAnsi="Wingdings" w:hint="default"/>
+        <w:sz w:val="20"/>
+      </w:rPr>
+    </w:lvl>
+    <w:lvl w:ilvl="3" w:tentative="1">
+      <w:start w:val="1"/>
+      <w:numFmt w:val="bullet"/>
+      <w:lvlText w:val=""/>
+      <w:lvlJc w:val="left"/>
+      <w:pPr>
+        <w:tabs>
+          <w:tab w:val="num" w:pos="2880"/>
+        </w:tabs>
+        <w:ind w:left="2880" w:hanging="360"/>
+      </w:pPr>
+      <w:rPr>
+        <w:rFonts w:ascii="Wingdings" w:hAnsi="Wingdings" w:hint="default"/>
+        <w:sz w:val="20"/>
+      </w:rPr>
+    </w:lvl>
+    <w:lvl w:ilvl="4" w:tentative="1">
+      <w:start w:val="1"/>
+      <w:numFmt w:val="bullet"/>
+      <w:lvlText w:val=""/>
+      <w:lvlJc w:val="left"/>
+      <w:pPr>
+        <w:tabs>
+          <w:tab w:val="num" w:pos="3600"/>
+        </w:tabs>
+        <w:ind w:left="3600" w:hanging="360"/>
+      </w:pPr>
+      <w:rPr>
+        <w:rFonts w:ascii="Wingdings" w:hAnsi="Wingdings" w:hint="default"/>
+        <w:sz w:val="20"/>
+      </w:rPr>
+    </w:lvl>
+    <w:lvl w:ilvl="5" w:tentative="1">
+      <w:start w:val="1"/>
+      <w:numFmt w:val="bullet"/>
+      <w:lvlText w:val=""/>
+      <w:lvlJc w:val="left"/>
+      <w:pPr>
+        <w:tabs>
+          <w:tab w:val="num" w:pos="4320"/>
+        </w:tabs>
+        <w:ind w:left="4320" w:hanging="360"/>
+      </w:pPr>
+      <w:rPr>
+        <w:rFonts w:ascii="Wingdings" w:hAnsi="Wingdings" w:hint="default"/>
+        <w:sz w:val="20"/>
+      </w:rPr>
+    </w:lvl>
+    <w:lvl w:ilvl="6" w:tentative="1">
+      <w:start w:val="1"/>
+      <w:numFmt w:val="bullet"/>
+      <w:lvlText w:val=""/>
+      <w:lvlJc w:val="left"/>
+      <w:pPr>
+        <w:tabs>
+          <w:tab w:val="num" w:pos="5040"/>
+        </w:tabs>
+        <w:ind w:left="5040" w:hanging="360"/>
+      </w:pPr>
+      <w:rPr>
+        <w:rFonts w:ascii="Wingdings" w:hAnsi="Wingdings" w:hint="default"/>
+        <w:sz w:val="20"/>
+      </w:rPr>
+    </w:lvl>
+    <w:lvl w:ilvl="7" w:tentative="1">
+      <w:start w:val="1"/>
+      <w:numFmt w:val="bullet"/>
+      <w:lvlText w:val=""/>
+      <w:lvlJc w:val="left"/>
+      <w:pPr>
+        <w:tabs>
+          <w:tab w:val="num" w:pos="5760"/>
+        </w:tabs>
+        <w:ind w:left="5760" w:hanging="360"/>
+      </w:pPr>
+      <w:rPr>
+        <w:rFonts w:ascii="Wingdings" w:hAnsi="Wingdings" w:hint="default"/>
+        <w:sz w:val="20"/>
+      </w:rPr>
+    </w:lvl>
+    <w:lvl w:ilvl="8" w:tentative="1">
+      <w:start w:val="1"/>
+      <w:numFmt w:val="bullet"/>
+      <w:lvlText w:val=""/>
+      <w:lvlJc w:val="left"/>
+      <w:pPr>
+        <w:tabs>
+          <w:tab w:val="num" w:pos="6480"/>
+        </w:tabs>
+        <w:ind w:left="6480" w:hanging="360"/>
+      </w:pPr>
+      <w:rPr>
+        <w:rFonts w:ascii="Wingdings" w:hAnsi="Wingdings" w:hint="default"/>
+        <w:sz w:val="20"/>
+      </w:rPr>
+    </w:lvl>
+  </w:abstractNum>
+  <w:abstractNum w:abstractNumId="3" w15:restartNumberingAfterBreak="0">
+    <w:nsid w:val="125D3891"/>
+    <w:multiLevelType w:val="multilevel"/>
+    <w:tmpl w:val="8DDE0444"/>
+    <w:lvl w:ilvl="0">
+      <w:start w:val="1"/>
+      <w:numFmt w:val="bullet"/>
+      <w:lvlText w:val=""/>
+      <w:lvlJc w:val="left"/>
+      <w:pPr>
+        <w:tabs>
+          <w:tab w:val="num" w:pos="720"/>
+        </w:tabs>
+        <w:ind w:left="720" w:hanging="360"/>
+      </w:pPr>
+      <w:rPr>
+        <w:rFonts w:ascii="Symbol" w:hAnsi="Symbol" w:hint="default"/>
+        <w:sz w:val="20"/>
+      </w:rPr>
+    </w:lvl>
+    <w:lvl w:ilvl="1" w:tentative="1">
+      <w:start w:val="1"/>
+      <w:numFmt w:val="bullet"/>
+      <w:lvlText w:val="o"/>
+      <w:lvlJc w:val="left"/>
+      <w:pPr>
+        <w:tabs>
+          <w:tab w:val="num" w:pos="1440"/>
+        </w:tabs>
+        <w:ind w:left="1440" w:hanging="360"/>
+      </w:pPr>
+      <w:rPr>
+        <w:rFonts w:ascii="Courier New" w:hAnsi="Courier New" w:hint="default"/>
+        <w:sz w:val="20"/>
+      </w:rPr>
+    </w:lvl>
+    <w:lvl w:ilvl="2" w:tentative="1">
+      <w:start w:val="1"/>
+      <w:numFmt w:val="bullet"/>
+      <w:lvlText w:val=""/>
+      <w:lvlJc w:val="left"/>
+      <w:pPr>
+        <w:tabs>
+          <w:tab w:val="num" w:pos="2160"/>
+        </w:tabs>
+        <w:ind w:left="2160" w:hanging="360"/>
+      </w:pPr>
+      <w:rPr>
+        <w:rFonts w:ascii="Wingdings" w:hAnsi="Wingdings" w:hint="default"/>
+        <w:sz w:val="20"/>
+      </w:rPr>
+    </w:lvl>
+    <w:lvl w:ilvl="3" w:tentative="1">
+      <w:start w:val="1"/>
+      <w:numFmt w:val="bullet"/>
+      <w:lvlText w:val=""/>
+      <w:lvlJc w:val="left"/>
+      <w:pPr>
+        <w:tabs>
+          <w:tab w:val="num" w:pos="2880"/>
+        </w:tabs>
+        <w:ind w:left="2880" w:hanging="360"/>
+      </w:pPr>
+      <w:rPr>
+        <w:rFonts w:ascii="Wingdings" w:hAnsi="Wingdings" w:hint="default"/>
+        <w:sz w:val="20"/>
+      </w:rPr>
+    </w:lvl>
+    <w:lvl w:ilvl="4" w:tentative="1">
+      <w:start w:val="1"/>
+      <w:numFmt w:val="bullet"/>
+      <w:lvlText w:val=""/>
+      <w:lvlJc w:val="left"/>
+      <w:pPr>
+        <w:tabs>
+          <w:tab w:val="num" w:pos="3600"/>
+        </w:tabs>
+        <w:ind w:left="3600" w:hanging="360"/>
+      </w:pPr>
+      <w:rPr>
+        <w:rFonts w:ascii="Wingdings" w:hAnsi="Wingdings" w:hint="default"/>
+        <w:sz w:val="20"/>
+      </w:rPr>
+    </w:lvl>
+    <w:lvl w:ilvl="5" w:tentative="1">
+      <w:start w:val="1"/>
+      <w:numFmt w:val="bullet"/>
+      <w:lvlText w:val=""/>
+      <w:lvlJc w:val="left"/>
+      <w:pPr>
+        <w:tabs>
+          <w:tab w:val="num" w:pos="4320"/>
+        </w:tabs>
+        <w:ind w:left="4320" w:hanging="360"/>
+      </w:pPr>
+      <w:rPr>
+        <w:rFonts w:ascii="Wingdings" w:hAnsi="Wingdings" w:hint="default"/>
+        <w:sz w:val="20"/>
+      </w:rPr>
+    </w:lvl>
+    <w:lvl w:ilvl="6" w:tentative="1">
+      <w:start w:val="1"/>
+      <w:numFmt w:val="bullet"/>
+      <w:lvlText w:val=""/>
+      <w:lvlJc w:val="left"/>
+      <w:pPr>
+        <w:tabs>
+          <w:tab w:val="num" w:pos="5040"/>
+        </w:tabs>
+        <w:ind w:left="5040" w:hanging="360"/>
+      </w:pPr>
+      <w:rPr>
+        <w:rFonts w:ascii="Wingdings" w:hAnsi="Wingdings" w:hint="default"/>
+        <w:sz w:val="20"/>
+      </w:rPr>
+    </w:lvl>
+    <w:lvl w:ilvl="7" w:tentative="1">
+      <w:start w:val="1"/>
+      <w:numFmt w:val="bullet"/>
+      <w:lvlText w:val=""/>
+      <w:lvlJc w:val="left"/>
+      <w:pPr>
+        <w:tabs>
+          <w:tab w:val="num" w:pos="5760"/>
+        </w:tabs>
+        <w:ind w:left="5760" w:hanging="360"/>
+      </w:pPr>
+      <w:rPr>
+        <w:rFonts w:ascii="Wingdings" w:hAnsi="Wingdings" w:hint="default"/>
+        <w:sz w:val="20"/>
+      </w:rPr>
+    </w:lvl>
+    <w:lvl w:ilvl="8" w:tentative="1">
+      <w:start w:val="1"/>
+      <w:numFmt w:val="bullet"/>
+      <w:lvlText w:val=""/>
+      <w:lvlJc w:val="left"/>
+      <w:pPr>
+        <w:tabs>
+          <w:tab w:val="num" w:pos="6480"/>
+        </w:tabs>
+        <w:ind w:left="6480" w:hanging="360"/>
+      </w:pPr>
+      <w:rPr>
+        <w:rFonts w:ascii="Wingdings" w:hAnsi="Wingdings" w:hint="default"/>
+        <w:sz w:val="20"/>
+      </w:rPr>
+    </w:lvl>
+  </w:abstractNum>
+  <w:abstractNum w:abstractNumId="4" w15:restartNumberingAfterBreak="0">
+    <w:nsid w:val="15465E97"/>
+    <w:multiLevelType w:val="multilevel"/>
+    <w:tmpl w:val="33128514"/>
+    <w:lvl w:ilvl="0">
+      <w:start w:val="1"/>
+      <w:numFmt w:val="bullet"/>
+      <w:lvlText w:val=""/>
+      <w:lvlJc w:val="left"/>
+      <w:pPr>
+        <w:tabs>
+          <w:tab w:val="num" w:pos="720"/>
+        </w:tabs>
+        <w:ind w:left="720" w:hanging="360"/>
+      </w:pPr>
+      <w:rPr>
+        <w:rFonts w:ascii="Symbol" w:hAnsi="Symbol" w:hint="default"/>
+        <w:sz w:val="20"/>
+      </w:rPr>
+    </w:lvl>
+    <w:lvl w:ilvl="1" w:tentative="1">
+      <w:start w:val="1"/>
+      <w:numFmt w:val="bullet"/>
+      <w:lvlText w:val="o"/>
+      <w:lvlJc w:val="left"/>
+      <w:pPr>
+        <w:tabs>
+          <w:tab w:val="num" w:pos="1440"/>
+        </w:tabs>
+        <w:ind w:left="1440" w:hanging="360"/>
+      </w:pPr>
+      <w:rPr>
+        <w:rFonts w:ascii="Courier New" w:hAnsi="Courier New" w:hint="default"/>
+        <w:sz w:val="20"/>
+      </w:rPr>
+    </w:lvl>
+    <w:lvl w:ilvl="2" w:tentative="1">
+      <w:start w:val="1"/>
+      <w:numFmt w:val="bullet"/>
+      <w:lvlText w:val=""/>
+      <w:lvlJc w:val="left"/>
+      <w:pPr>
+        <w:tabs>
+          <w:tab w:val="num" w:pos="2160"/>
+        </w:tabs>
+        <w:ind w:left="2160" w:hanging="360"/>
+      </w:pPr>
+      <w:rPr>
+        <w:rFonts w:ascii="Wingdings" w:hAnsi="Wingdings" w:hint="default"/>
+        <w:sz w:val="20"/>
+      </w:rPr>
+    </w:lvl>
+    <w:lvl w:ilvl="3" w:tentative="1">
+      <w:start w:val="1"/>
+      <w:numFmt w:val="bullet"/>
+      <w:lvlText w:val=""/>
+      <w:lvlJc w:val="left"/>
+      <w:pPr>
+        <w:tabs>
+          <w:tab w:val="num" w:pos="2880"/>
+        </w:tabs>
+        <w:ind w:left="2880" w:hanging="360"/>
+      </w:pPr>
+      <w:rPr>
+        <w:rFonts w:ascii="Wingdings" w:hAnsi="Wingdings" w:hint="default"/>
+        <w:sz w:val="20"/>
+      </w:rPr>
+    </w:lvl>
+    <w:lvl w:ilvl="4" w:tentative="1">
+      <w:start w:val="1"/>
+      <w:numFmt w:val="bullet"/>
+      <w:lvlText w:val=""/>
+      <w:lvlJc w:val="left"/>
+      <w:pPr>
+        <w:tabs>
+          <w:tab w:val="num" w:pos="3600"/>
+        </w:tabs>
+        <w:ind w:left="3600" w:hanging="360"/>
+      </w:pPr>
+      <w:rPr>
+        <w:rFonts w:ascii="Wingdings" w:hAnsi="Wingdings" w:hint="default"/>
+        <w:sz w:val="20"/>
+      </w:rPr>
+    </w:lvl>
+    <w:lvl w:ilvl="5" w:tentative="1">
+      <w:start w:val="1"/>
+      <w:numFmt w:val="bullet"/>
+      <w:lvlText w:val=""/>
+      <w:lvlJc w:val="left"/>
+      <w:pPr>
+        <w:tabs>
+          <w:tab w:val="num" w:pos="4320"/>
+        </w:tabs>
+        <w:ind w:left="4320" w:hanging="360"/>
+      </w:pPr>
+      <w:rPr>
+        <w:rFonts w:ascii="Wingdings" w:hAnsi="Wingdings" w:hint="default"/>
+        <w:sz w:val="20"/>
+      </w:rPr>
+    </w:lvl>
+    <w:lvl w:ilvl="6" w:tentative="1">
+      <w:start w:val="1"/>
+      <w:numFmt w:val="bullet"/>
+      <w:lvlText w:val=""/>
+      <w:lvlJc w:val="left"/>
+      <w:pPr>
+        <w:tabs>
+          <w:tab w:val="num" w:pos="5040"/>
+        </w:tabs>
+        <w:ind w:left="5040" w:hanging="360"/>
+      </w:pPr>
+      <w:rPr>
+        <w:rFonts w:ascii="Wingdings" w:hAnsi="Wingdings" w:hint="default"/>
+        <w:sz w:val="20"/>
+      </w:rPr>
+    </w:lvl>
+    <w:lvl w:ilvl="7" w:tentative="1">
+      <w:start w:val="1"/>
+      <w:numFmt w:val="bullet"/>
+      <w:lvlText w:val=""/>
+      <w:lvlJc w:val="left"/>
+      <w:pPr>
+        <w:tabs>
+          <w:tab w:val="num" w:pos="5760"/>
+        </w:tabs>
+        <w:ind w:left="5760" w:hanging="360"/>
+      </w:pPr>
+      <w:rPr>
+        <w:rFonts w:ascii="Wingdings" w:hAnsi="Wingdings" w:hint="default"/>
+        <w:sz w:val="20"/>
+      </w:rPr>
+    </w:lvl>
+    <w:lvl w:ilvl="8" w:tentative="1">
+      <w:start w:val="1"/>
+      <w:numFmt w:val="bullet"/>
+      <w:lvlText w:val=""/>
+      <w:lvlJc w:val="left"/>
+      <w:pPr>
+        <w:tabs>
+          <w:tab w:val="num" w:pos="6480"/>
+        </w:tabs>
+        <w:ind w:left="6480" w:hanging="360"/>
+      </w:pPr>
+      <w:rPr>
+        <w:rFonts w:ascii="Wingdings" w:hAnsi="Wingdings" w:hint="default"/>
+        <w:sz w:val="20"/>
+      </w:rPr>
+    </w:lvl>
+  </w:abstractNum>
+  <w:abstractNum w:abstractNumId="5" w15:restartNumberingAfterBreak="0">
+    <w:nsid w:val="261B0A76"/>
+    <w:multiLevelType w:val="multilevel"/>
+    <w:tmpl w:val="F59E660C"/>
+    <w:lvl w:ilvl="0">
+      <w:start w:val="1"/>
+      <w:numFmt w:val="bullet"/>
+      <w:lvlText w:val=""/>
+      <w:lvlJc w:val="left"/>
+      <w:pPr>
+        <w:tabs>
+          <w:tab w:val="num" w:pos="720"/>
+        </w:tabs>
+        <w:ind w:left="720" w:hanging="360"/>
+      </w:pPr>
+      <w:rPr>
+        <w:rFonts w:ascii="Symbol" w:hAnsi="Symbol" w:hint="default"/>
+        <w:sz w:val="20"/>
+      </w:rPr>
+    </w:lvl>
+    <w:lvl w:ilvl="1" w:tentative="1">
+      <w:start w:val="1"/>
+      <w:numFmt w:val="bullet"/>
+      <w:lvlText w:val="o"/>
+      <w:lvlJc w:val="left"/>
+      <w:pPr>
+        <w:tabs>
+          <w:tab w:val="num" w:pos="1440"/>
+        </w:tabs>
+        <w:ind w:left="1440" w:hanging="360"/>
+      </w:pPr>
+      <w:rPr>
+        <w:rFonts w:ascii="Courier New" w:hAnsi="Courier New" w:hint="default"/>
+        <w:sz w:val="20"/>
+      </w:rPr>
+    </w:lvl>
+    <w:lvl w:ilvl="2" w:tentative="1">
+      <w:start w:val="1"/>
+      <w:numFmt w:val="bullet"/>
+      <w:lvlText w:val=""/>
+      <w:lvlJc w:val="left"/>
+      <w:pPr>
+        <w:tabs>
+          <w:tab w:val="num" w:pos="2160"/>
+        </w:tabs>
+        <w:ind w:left="2160" w:hanging="360"/>
+      </w:pPr>
+      <w:rPr>
+        <w:rFonts w:ascii="Wingdings" w:hAnsi="Wingdings" w:hint="default"/>
+        <w:sz w:val="20"/>
+      </w:rPr>
+    </w:lvl>
+    <w:lvl w:ilvl="3" w:tentative="1">
+      <w:start w:val="1"/>
+      <w:numFmt w:val="bullet"/>
+      <w:lvlText w:val=""/>
+      <w:lvlJc w:val="left"/>
+      <w:pPr>
+        <w:tabs>
+          <w:tab w:val="num" w:pos="2880"/>
+        </w:tabs>
+        <w:ind w:left="2880" w:hanging="360"/>
+      </w:pPr>
+      <w:rPr>
+        <w:rFonts w:ascii="Wingdings" w:hAnsi="Wingdings" w:hint="default"/>
+        <w:sz w:val="20"/>
+      </w:rPr>
+    </w:lvl>
+    <w:lvl w:ilvl="4" w:tentative="1">
+      <w:start w:val="1"/>
+      <w:numFmt w:val="bullet"/>
+      <w:lvlText w:val=""/>
+      <w:lvlJc w:val="left"/>
+      <w:pPr>
+        <w:tabs>
+          <w:tab w:val="num" w:pos="3600"/>
+        </w:tabs>
+        <w:ind w:left="3600" w:hanging="360"/>
+      </w:pPr>
+      <w:rPr>
+        <w:rFonts w:ascii="Wingdings" w:hAnsi="Wingdings" w:hint="default"/>
+        <w:sz w:val="20"/>
+      </w:rPr>
+    </w:lvl>
+    <w:lvl w:ilvl="5" w:tentative="1">
+      <w:start w:val="1"/>
+      <w:numFmt w:val="bullet"/>
+      <w:lvlText w:val=""/>
+      <w:lvlJc w:val="left"/>
+      <w:pPr>
+        <w:tabs>
+          <w:tab w:val="num" w:pos="4320"/>
+        </w:tabs>
+        <w:ind w:left="4320" w:hanging="360"/>
+      </w:pPr>
+      <w:rPr>
+        <w:rFonts w:ascii="Wingdings" w:hAnsi="Wingdings" w:hint="default"/>
+        <w:sz w:val="20"/>
+      </w:rPr>
+    </w:lvl>
+    <w:lvl w:ilvl="6" w:tentative="1">
+      <w:start w:val="1"/>
+      <w:numFmt w:val="bullet"/>
+      <w:lvlText w:val=""/>
+      <w:lvlJc w:val="left"/>
+      <w:pPr>
+        <w:tabs>
+          <w:tab w:val="num" w:pos="5040"/>
+        </w:tabs>
+        <w:ind w:left="5040" w:hanging="360"/>
+      </w:pPr>
+      <w:rPr>
+        <w:rFonts w:ascii="Wingdings" w:hAnsi="Wingdings" w:hint="default"/>
+        <w:sz w:val="20"/>
+      </w:rPr>
+    </w:lvl>
+    <w:lvl w:ilvl="7" w:tentative="1">
+      <w:start w:val="1"/>
+      <w:numFmt w:val="bullet"/>
+      <w:lvlText w:val=""/>
+      <w:lvlJc w:val="left"/>
+      <w:pPr>
+        <w:tabs>
+          <w:tab w:val="num" w:pos="5760"/>
+        </w:tabs>
+        <w:ind w:left="5760" w:hanging="360"/>
+      </w:pPr>
+      <w:rPr>
+        <w:rFonts w:ascii="Wingdings" w:hAnsi="Wingdings" w:hint="default"/>
+        <w:sz w:val="20"/>
+      </w:rPr>
+    </w:lvl>
+    <w:lvl w:ilvl="8" w:tentative="1">
+      <w:start w:val="1"/>
+      <w:numFmt w:val="bullet"/>
+      <w:lvlText w:val=""/>
+      <w:lvlJc w:val="left"/>
+      <w:pPr>
+        <w:tabs>
+          <w:tab w:val="num" w:pos="6480"/>
+        </w:tabs>
+        <w:ind w:left="6480" w:hanging="360"/>
+      </w:pPr>
+      <w:rPr>
+        <w:rFonts w:ascii="Wingdings" w:hAnsi="Wingdings" w:hint="default"/>
+        <w:sz w:val="20"/>
+      </w:rPr>
+    </w:lvl>
+  </w:abstractNum>
+  <w:abstractNum w:abstractNumId="6" w15:restartNumberingAfterBreak="0">
+    <w:nsid w:val="2A9D10F8"/>
+    <w:multiLevelType w:val="multilevel"/>
+    <w:tmpl w:val="6E02A15A"/>
+    <w:lvl w:ilvl="0">
+      <w:start w:val="1"/>
+      <w:numFmt w:val="bullet"/>
+      <w:lvlText w:val=""/>
+      <w:lvlJc w:val="left"/>
+      <w:pPr>
+        <w:tabs>
+          <w:tab w:val="num" w:pos="720"/>
+        </w:tabs>
+        <w:ind w:left="720" w:hanging="360"/>
+      </w:pPr>
+      <w:rPr>
+        <w:rFonts w:ascii="Symbol" w:hAnsi="Symbol" w:hint="default"/>
+        <w:sz w:val="20"/>
+      </w:rPr>
+    </w:lvl>
+    <w:lvl w:ilvl="1" w:tentative="1">
+      <w:start w:val="1"/>
+      <w:numFmt w:val="bullet"/>
+      <w:lvlText w:val="o"/>
+      <w:lvlJc w:val="left"/>
+      <w:pPr>
+        <w:tabs>
+          <w:tab w:val="num" w:pos="1440"/>
+        </w:tabs>
+        <w:ind w:left="1440" w:hanging="360"/>
+      </w:pPr>
+      <w:rPr>
+        <w:rFonts w:ascii="Courier New" w:hAnsi="Courier New" w:hint="default"/>
+        <w:sz w:val="20"/>
+      </w:rPr>
+    </w:lvl>
+    <w:lvl w:ilvl="2" w:tentative="1">
+      <w:start w:val="1"/>
+      <w:numFmt w:val="bullet"/>
+      <w:lvlText w:val=""/>
+      <w:lvlJc w:val="left"/>
+      <w:pPr>
+        <w:tabs>
+          <w:tab w:val="num" w:pos="2160"/>
+        </w:tabs>
+        <w:ind w:left="2160" w:hanging="360"/>
+      </w:pPr>
+      <w:rPr>
+        <w:rFonts w:ascii="Wingdings" w:hAnsi="Wingdings" w:hint="default"/>
+        <w:sz w:val="20"/>
+      </w:rPr>
+    </w:lvl>
+    <w:lvl w:ilvl="3" w:tentative="1">
+      <w:start w:val="1"/>
+      <w:numFmt w:val="bullet"/>
+      <w:lvlText w:val=""/>
+      <w:lvlJc w:val="left"/>
+      <w:pPr>
+        <w:tabs>
+          <w:tab w:val="num" w:pos="2880"/>
+        </w:tabs>
+        <w:ind w:left="2880" w:hanging="360"/>
+      </w:pPr>
+      <w:rPr>
+        <w:rFonts w:ascii="Wingdings" w:hAnsi="Wingdings" w:hint="default"/>
+        <w:sz w:val="20"/>
+      </w:rPr>
+    </w:lvl>
+    <w:lvl w:ilvl="4" w:tentative="1">
+      <w:start w:val="1"/>
+      <w:numFmt w:val="bullet"/>
+      <w:lvlText w:val=""/>
+      <w:lvlJc w:val="left"/>
+      <w:pPr>
+        <w:tabs>
+          <w:tab w:val="num" w:pos="3600"/>
+        </w:tabs>
+        <w:ind w:left="3600" w:hanging="360"/>
+      </w:pPr>
+      <w:rPr>
+        <w:rFonts w:ascii="Wingdings" w:hAnsi="Wingdings" w:hint="default"/>
+        <w:sz w:val="20"/>
+      </w:rPr>
+    </w:lvl>
+    <w:lvl w:ilvl="5" w:tentative="1">
+      <w:start w:val="1"/>
+      <w:numFmt w:val="bullet"/>
+      <w:lvlText w:val=""/>
+      <w:lvlJc w:val="left"/>
+      <w:pPr>
+        <w:tabs>
+          <w:tab w:val="num" w:pos="4320"/>
+        </w:tabs>
+        <w:ind w:left="4320" w:hanging="360"/>
+      </w:pPr>
+      <w:rPr>
+        <w:rFonts w:ascii="Wingdings" w:hAnsi="Wingdings" w:hint="default"/>
+        <w:sz w:val="20"/>
+      </w:rPr>
+    </w:lvl>
+    <w:lvl w:ilvl="6" w:tentative="1">
+      <w:start w:val="1"/>
+      <w:numFmt w:val="bullet"/>
+      <w:lvlText w:val=""/>
+      <w:lvlJc w:val="left"/>
+      <w:pPr>
+        <w:tabs>
+          <w:tab w:val="num" w:pos="5040"/>
+        </w:tabs>
+        <w:ind w:left="5040" w:hanging="360"/>
+      </w:pPr>
+      <w:rPr>
+        <w:rFonts w:ascii="Wingdings" w:hAnsi="Wingdings" w:hint="default"/>
+        <w:sz w:val="20"/>
+      </w:rPr>
+    </w:lvl>
+    <w:lvl w:ilvl="7" w:tentative="1">
+      <w:start w:val="1"/>
+      <w:numFmt w:val="bullet"/>
+      <w:lvlText w:val=""/>
+      <w:lvlJc w:val="left"/>
+      <w:pPr>
+        <w:tabs>
+          <w:tab w:val="num" w:pos="5760"/>
+        </w:tabs>
+        <w:ind w:left="5760" w:hanging="360"/>
+      </w:pPr>
+      <w:rPr>
+        <w:rFonts w:ascii="Wingdings" w:hAnsi="Wingdings" w:hint="default"/>
+        <w:sz w:val="20"/>
+      </w:rPr>
+    </w:lvl>
+    <w:lvl w:ilvl="8" w:tentative="1">
+      <w:start w:val="1"/>
+      <w:numFmt w:val="bullet"/>
+      <w:lvlText w:val=""/>
+      <w:lvlJc w:val="left"/>
+      <w:pPr>
+        <w:tabs>
+          <w:tab w:val="num" w:pos="6480"/>
+        </w:tabs>
+        <w:ind w:left="6480" w:hanging="360"/>
+      </w:pPr>
+      <w:rPr>
+        <w:rFonts w:ascii="Wingdings" w:hAnsi="Wingdings" w:hint="default"/>
+        <w:sz w:val="20"/>
+      </w:rPr>
+    </w:lvl>
+  </w:abstractNum>
+  <w:abstractNum w:abstractNumId="7" w15:restartNumberingAfterBreak="0">
+    <w:nsid w:val="305027E7"/>
+    <w:multiLevelType w:val="multilevel"/>
+    <w:tmpl w:val="F464503E"/>
+    <w:lvl w:ilvl="0">
+      <w:start w:val="1"/>
+      <w:numFmt w:val="bullet"/>
+      <w:lvlText w:val=""/>
+      <w:lvlJc w:val="left"/>
+      <w:pPr>
+        <w:tabs>
+          <w:tab w:val="num" w:pos="720"/>
+        </w:tabs>
+        <w:ind w:left="720" w:hanging="360"/>
+      </w:pPr>
+      <w:rPr>
+        <w:rFonts w:ascii="Symbol" w:hAnsi="Symbol" w:hint="default"/>
+        <w:sz w:val="20"/>
+      </w:rPr>
+    </w:lvl>
+    <w:lvl w:ilvl="1">
+      <w:start w:val="1"/>
+      <w:numFmt w:val="bullet"/>
+      <w:lvlText w:val="o"/>
+      <w:lvlJc w:val="left"/>
+      <w:pPr>
+        <w:tabs>
+          <w:tab w:val="num" w:pos="1440"/>
+        </w:tabs>
+        <w:ind w:left="1440" w:hanging="360"/>
+      </w:pPr>
+      <w:rPr>
+        <w:rFonts w:ascii="Courier New" w:hAnsi="Courier New" w:hint="default"/>
+        <w:sz w:val="20"/>
+      </w:rPr>
+    </w:lvl>
+    <w:lvl w:ilvl="2" w:tentative="1">
+      <w:start w:val="1"/>
+      <w:numFmt w:val="bullet"/>
+      <w:lvlText w:val=""/>
+      <w:lvlJc w:val="left"/>
+      <w:pPr>
+        <w:tabs>
+          <w:tab w:val="num" w:pos="2160"/>
+        </w:tabs>
+        <w:ind w:left="2160" w:hanging="360"/>
+      </w:pPr>
+      <w:rPr>
+        <w:rFonts w:ascii="Wingdings" w:hAnsi="Wingdings" w:hint="default"/>
+        <w:sz w:val="20"/>
+      </w:rPr>
+    </w:lvl>
+    <w:lvl w:ilvl="3" w:tentative="1">
+      <w:start w:val="1"/>
+      <w:numFmt w:val="bullet"/>
+      <w:lvlText w:val=""/>
+      <w:lvlJc w:val="left"/>
+      <w:pPr>
+        <w:tabs>
+          <w:tab w:val="num" w:pos="2880"/>
+        </w:tabs>
+        <w:ind w:left="2880" w:hanging="360"/>
+      </w:pPr>
+      <w:rPr>
+        <w:rFonts w:ascii="Wingdings" w:hAnsi="Wingdings" w:hint="default"/>
+        <w:sz w:val="20"/>
+      </w:rPr>
+    </w:lvl>
+    <w:lvl w:ilvl="4" w:tentative="1">
+      <w:start w:val="1"/>
+      <w:numFmt w:val="bullet"/>
+      <w:lvlText w:val=""/>
+      <w:lvlJc w:val="left"/>
+      <w:pPr>
+        <w:tabs>
+          <w:tab w:val="num" w:pos="3600"/>
+        </w:tabs>
+        <w:ind w:left="3600" w:hanging="360"/>
+      </w:pPr>
+      <w:rPr>
+        <w:rFonts w:ascii="Wingdings" w:hAnsi="Wingdings" w:hint="default"/>
+        <w:sz w:val="20"/>
+      </w:rPr>
+    </w:lvl>
+    <w:lvl w:ilvl="5" w:tentative="1">
+      <w:start w:val="1"/>
+      <w:numFmt w:val="bullet"/>
+      <w:lvlText w:val=""/>
+      <w:lvlJc w:val="left"/>
+      <w:pPr>
+        <w:tabs>
+          <w:tab w:val="num" w:pos="4320"/>
+        </w:tabs>
+        <w:ind w:left="4320" w:hanging="360"/>
+      </w:pPr>
+      <w:rPr>
+        <w:rFonts w:ascii="Wingdings" w:hAnsi="Wingdings" w:hint="default"/>
+        <w:sz w:val="20"/>
+      </w:rPr>
+    </w:lvl>
+    <w:lvl w:ilvl="6" w:tentative="1">
+      <w:start w:val="1"/>
+      <w:numFmt w:val="bullet"/>
+      <w:lvlText w:val=""/>
+      <w:lvlJc w:val="left"/>
+      <w:pPr>
+        <w:tabs>
+          <w:tab w:val="num" w:pos="5040"/>
+        </w:tabs>
+        <w:ind w:left="5040" w:hanging="360"/>
+      </w:pPr>
+      <w:rPr>
+        <w:rFonts w:ascii="Wingdings" w:hAnsi="Wingdings" w:hint="default"/>
+        <w:sz w:val="20"/>
+      </w:rPr>
+    </w:lvl>
+    <w:lvl w:ilvl="7" w:tentative="1">
+      <w:start w:val="1"/>
+      <w:numFmt w:val="bullet"/>
+      <w:lvlText w:val=""/>
+      <w:lvlJc w:val="left"/>
+      <w:pPr>
+        <w:tabs>
+          <w:tab w:val="num" w:pos="5760"/>
+        </w:tabs>
+        <w:ind w:left="5760" w:hanging="360"/>
+      </w:pPr>
+      <w:rPr>
+        <w:rFonts w:ascii="Wingdings" w:hAnsi="Wingdings" w:hint="default"/>
+        <w:sz w:val="20"/>
+      </w:rPr>
+    </w:lvl>
+    <w:lvl w:ilvl="8" w:tentative="1">
+      <w:start w:val="1"/>
+      <w:numFmt w:val="bullet"/>
+      <w:lvlText w:val=""/>
+      <w:lvlJc w:val="left"/>
+      <w:pPr>
+        <w:tabs>
+          <w:tab w:val="num" w:pos="6480"/>
+        </w:tabs>
+        <w:ind w:left="6480" w:hanging="360"/>
+      </w:pPr>
+      <w:rPr>
+        <w:rFonts w:ascii="Wingdings" w:hAnsi="Wingdings" w:hint="default"/>
+        <w:sz w:val="20"/>
+      </w:rPr>
+    </w:lvl>
+  </w:abstractNum>
+  <w:abstractNum w:abstractNumId="8" w15:restartNumberingAfterBreak="0">
+    <w:nsid w:val="34891CFF"/>
+    <w:multiLevelType w:val="multilevel"/>
+    <w:tmpl w:val="5454B160"/>
+    <w:lvl w:ilvl="0">
+      <w:start w:val="1"/>
+      <w:numFmt w:val="bullet"/>
+      <w:lvlText w:val=""/>
+      <w:lvlJc w:val="left"/>
+      <w:pPr>
+        <w:tabs>
+          <w:tab w:val="num" w:pos="720"/>
+        </w:tabs>
+        <w:ind w:left="720" w:hanging="360"/>
+      </w:pPr>
+      <w:rPr>
+        <w:rFonts w:ascii="Symbol" w:hAnsi="Symbol" w:hint="default"/>
+        <w:sz w:val="20"/>
+      </w:rPr>
+    </w:lvl>
+    <w:lvl w:ilvl="1" w:tentative="1">
+      <w:start w:val="1"/>
+      <w:numFmt w:val="bullet"/>
+      <w:lvlText w:val="o"/>
+      <w:lvlJc w:val="left"/>
+      <w:pPr>
+        <w:tabs>
+          <w:tab w:val="num" w:pos="1440"/>
+        </w:tabs>
+        <w:ind w:left="1440" w:hanging="360"/>
+      </w:pPr>
+      <w:rPr>
+        <w:rFonts w:ascii="Courier New" w:hAnsi="Courier New" w:hint="default"/>
+        <w:sz w:val="20"/>
+      </w:rPr>
+    </w:lvl>
+    <w:lvl w:ilvl="2" w:tentative="1">
+      <w:start w:val="1"/>
+      <w:numFmt w:val="bullet"/>
+      <w:lvlText w:val=""/>
+      <w:lvlJc w:val="left"/>
+      <w:pPr>
+        <w:tabs>
+          <w:tab w:val="num" w:pos="2160"/>
+        </w:tabs>
+        <w:ind w:left="2160" w:hanging="360"/>
+      </w:pPr>
+      <w:rPr>
+        <w:rFonts w:ascii="Wingdings" w:hAnsi="Wingdings" w:hint="default"/>
+        <w:sz w:val="20"/>
+      </w:rPr>
+    </w:lvl>
+    <w:lvl w:ilvl="3" w:tentative="1">
+      <w:start w:val="1"/>
+      <w:numFmt w:val="bullet"/>
+      <w:lvlText w:val=""/>
+      <w:lvlJc w:val="left"/>
+      <w:pPr>
+        <w:tabs>
+          <w:tab w:val="num" w:pos="2880"/>
+        </w:tabs>
+        <w:ind w:left="2880" w:hanging="360"/>
+      </w:pPr>
+      <w:rPr>
+        <w:rFonts w:ascii="Wingdings" w:hAnsi="Wingdings" w:hint="default"/>
+        <w:sz w:val="20"/>
+      </w:rPr>
+    </w:lvl>
+    <w:lvl w:ilvl="4" w:tentative="1">
+      <w:start w:val="1"/>
+      <w:numFmt w:val="bullet"/>
+      <w:lvlText w:val=""/>
+      <w:lvlJc w:val="left"/>
+      <w:pPr>
+        <w:tabs>
+          <w:tab w:val="num" w:pos="3600"/>
+        </w:tabs>
+        <w:ind w:left="3600" w:hanging="360"/>
+      </w:pPr>
+      <w:rPr>
+        <w:rFonts w:ascii="Wingdings" w:hAnsi="Wingdings" w:hint="default"/>
+        <w:sz w:val="20"/>
+      </w:rPr>
+    </w:lvl>
+    <w:lvl w:ilvl="5" w:tentative="1">
+      <w:start w:val="1"/>
+      <w:numFmt w:val="bullet"/>
+      <w:lvlText w:val=""/>
+      <w:lvlJc w:val="left"/>
+      <w:pPr>
+        <w:tabs>
+          <w:tab w:val="num" w:pos="4320"/>
+        </w:tabs>
+        <w:ind w:left="4320" w:hanging="360"/>
+      </w:pPr>
+      <w:rPr>
+        <w:rFonts w:ascii="Wingdings" w:hAnsi="Wingdings" w:hint="default"/>
+        <w:sz w:val="20"/>
+      </w:rPr>
+    </w:lvl>
+    <w:lvl w:ilvl="6" w:tentative="1">
+      <w:start w:val="1"/>
+      <w:numFmt w:val="bullet"/>
+      <w:lvlText w:val=""/>
+      <w:lvlJc w:val="left"/>
+      <w:pPr>
+        <w:tabs>
+          <w:tab w:val="num" w:pos="5040"/>
+        </w:tabs>
+        <w:ind w:left="5040" w:hanging="360"/>
+      </w:pPr>
+      <w:rPr>
+        <w:rFonts w:ascii="Wingdings" w:hAnsi="Wingdings" w:hint="default"/>
+        <w:sz w:val="20"/>
+      </w:rPr>
+    </w:lvl>
+    <w:lvl w:ilvl="7" w:tentative="1">
+      <w:start w:val="1"/>
+      <w:numFmt w:val="bullet"/>
+      <w:lvlText w:val=""/>
+      <w:lvlJc w:val="left"/>
+      <w:pPr>
+        <w:tabs>
+          <w:tab w:val="num" w:pos="5760"/>
+        </w:tabs>
+        <w:ind w:left="5760" w:hanging="360"/>
+      </w:pPr>
+      <w:rPr>
+        <w:rFonts w:ascii="Wingdings" w:hAnsi="Wingdings" w:hint="default"/>
+        <w:sz w:val="20"/>
+      </w:rPr>
+    </w:lvl>
+    <w:lvl w:ilvl="8" w:tentative="1">
+      <w:start w:val="1"/>
+      <w:numFmt w:val="bullet"/>
+      <w:lvlText w:val=""/>
+      <w:lvlJc w:val="left"/>
+      <w:pPr>
+        <w:tabs>
+          <w:tab w:val="num" w:pos="6480"/>
+        </w:tabs>
+        <w:ind w:left="6480" w:hanging="360"/>
+      </w:pPr>
+      <w:rPr>
+        <w:rFonts w:ascii="Wingdings" w:hAnsi="Wingdings" w:hint="default"/>
+        <w:sz w:val="20"/>
+      </w:rPr>
+    </w:lvl>
+  </w:abstractNum>
+  <w:abstractNum w:abstractNumId="9" w15:restartNumberingAfterBreak="0">
+    <w:nsid w:val="4056584F"/>
+    <w:multiLevelType w:val="multilevel"/>
+    <w:tmpl w:val="15FA7366"/>
+    <w:lvl w:ilvl="0">
+      <w:start w:val="1"/>
+      <w:numFmt w:val="bullet"/>
+      <w:lvlText w:val=""/>
+      <w:lvlJc w:val="left"/>
+      <w:pPr>
+        <w:tabs>
+          <w:tab w:val="num" w:pos="720"/>
+        </w:tabs>
+        <w:ind w:left="720" w:hanging="360"/>
+      </w:pPr>
+      <w:rPr>
+        <w:rFonts w:ascii="Symbol" w:hAnsi="Symbol" w:hint="default"/>
+        <w:sz w:val="20"/>
+      </w:rPr>
+    </w:lvl>
+    <w:lvl w:ilvl="1" w:tentative="1">
+      <w:start w:val="1"/>
+      <w:numFmt w:val="bullet"/>
+      <w:lvlText w:val="o"/>
+      <w:lvlJc w:val="left"/>
+      <w:pPr>
+        <w:tabs>
+          <w:tab w:val="num" w:pos="1440"/>
+        </w:tabs>
+        <w:ind w:left="1440" w:hanging="360"/>
+      </w:pPr>
+      <w:rPr>
+        <w:rFonts w:ascii="Courier New" w:hAnsi="Courier New" w:hint="default"/>
+        <w:sz w:val="20"/>
+      </w:rPr>
+    </w:lvl>
+    <w:lvl w:ilvl="2" w:tentative="1">
+      <w:start w:val="1"/>
+      <w:numFmt w:val="bullet"/>
+      <w:lvlText w:val=""/>
+      <w:lvlJc w:val="left"/>
+      <w:pPr>
+        <w:tabs>
+          <w:tab w:val="num" w:pos="2160"/>
+        </w:tabs>
+        <w:ind w:left="2160" w:hanging="360"/>
+      </w:pPr>
+      <w:rPr>
+        <w:rFonts w:ascii="Wingdings" w:hAnsi="Wingdings" w:hint="default"/>
+        <w:sz w:val="20"/>
+      </w:rPr>
+    </w:lvl>
+    <w:lvl w:ilvl="3" w:tentative="1">
+      <w:start w:val="1"/>
+      <w:numFmt w:val="bullet"/>
+      <w:lvlText w:val=""/>
+      <w:lvlJc w:val="left"/>
+      <w:pPr>
+        <w:tabs>
+          <w:tab w:val="num" w:pos="2880"/>
+        </w:tabs>
+        <w:ind w:left="2880" w:hanging="360"/>
+      </w:pPr>
+      <w:rPr>
+        <w:rFonts w:ascii="Wingdings" w:hAnsi="Wingdings" w:hint="default"/>
+        <w:sz w:val="20"/>
+      </w:rPr>
+    </w:lvl>
+    <w:lvl w:ilvl="4" w:tentative="1">
+      <w:start w:val="1"/>
+      <w:numFmt w:val="bullet"/>
+      <w:lvlText w:val=""/>
+      <w:lvlJc w:val="left"/>
+      <w:pPr>
+        <w:tabs>
+          <w:tab w:val="num" w:pos="3600"/>
+        </w:tabs>
+        <w:ind w:left="3600" w:hanging="360"/>
+      </w:pPr>
+      <w:rPr>
+        <w:rFonts w:ascii="Wingdings" w:hAnsi="Wingdings" w:hint="default"/>
+        <w:sz w:val="20"/>
+      </w:rPr>
+    </w:lvl>
+    <w:lvl w:ilvl="5" w:tentative="1">
+      <w:start w:val="1"/>
+      <w:numFmt w:val="bullet"/>
+      <w:lvlText w:val=""/>
+      <w:lvlJc w:val="left"/>
+      <w:pPr>
+        <w:tabs>
+          <w:tab w:val="num" w:pos="4320"/>
+        </w:tabs>
+        <w:ind w:left="4320" w:hanging="360"/>
+      </w:pPr>
+      <w:rPr>
+        <w:rFonts w:ascii="Wingdings" w:hAnsi="Wingdings" w:hint="default"/>
+        <w:sz w:val="20"/>
+      </w:rPr>
+    </w:lvl>
+    <w:lvl w:ilvl="6" w:tentative="1">
+      <w:start w:val="1"/>
+      <w:numFmt w:val="bullet"/>
+      <w:lvlText w:val=""/>
+      <w:lvlJc w:val="left"/>
+      <w:pPr>
+        <w:tabs>
+          <w:tab w:val="num" w:pos="5040"/>
+        </w:tabs>
+        <w:ind w:left="5040" w:hanging="360"/>
+      </w:pPr>
+      <w:rPr>
+        <w:rFonts w:ascii="Wingdings" w:hAnsi="Wingdings" w:hint="default"/>
+        <w:sz w:val="20"/>
+      </w:rPr>
+    </w:lvl>
+    <w:lvl w:ilvl="7" w:tentative="1">
+      <w:start w:val="1"/>
+      <w:numFmt w:val="bullet"/>
+      <w:lvlText w:val=""/>
+      <w:lvlJc w:val="left"/>
+      <w:pPr>
+        <w:tabs>
+          <w:tab w:val="num" w:pos="5760"/>
+        </w:tabs>
+        <w:ind w:left="5760" w:hanging="360"/>
+      </w:pPr>
+      <w:rPr>
+        <w:rFonts w:ascii="Wingdings" w:hAnsi="Wingdings" w:hint="default"/>
+        <w:sz w:val="20"/>
+      </w:rPr>
+    </w:lvl>
+    <w:lvl w:ilvl="8" w:tentative="1">
+      <w:start w:val="1"/>
+      <w:numFmt w:val="bullet"/>
+      <w:lvlText w:val=""/>
+      <w:lvlJc w:val="left"/>
+      <w:pPr>
+        <w:tabs>
+          <w:tab w:val="num" w:pos="6480"/>
+        </w:tabs>
+        <w:ind w:left="6480" w:hanging="360"/>
+      </w:pPr>
+      <w:rPr>
+        <w:rFonts w:ascii="Wingdings" w:hAnsi="Wingdings" w:hint="default"/>
+        <w:sz w:val="20"/>
+      </w:rPr>
+    </w:lvl>
+  </w:abstractNum>
+  <w:abstractNum w:abstractNumId="10" w15:restartNumberingAfterBreak="0">
     <w:nsid w:val="420B527C"/>
     <w:multiLevelType w:val="multilevel"/>
     <w:tmpl w:val="2D72DC5C"/>
@@ -764,7 +2599,1050 @@
       </w:rPr>
     </w:lvl>
   </w:abstractNum>
-  <w:abstractNum w:abstractNumId="1" w15:restartNumberingAfterBreak="0">
+  <w:abstractNum w:abstractNumId="11" w15:restartNumberingAfterBreak="0">
+    <w:nsid w:val="438E53CE"/>
+    <w:multiLevelType w:val="multilevel"/>
+    <w:tmpl w:val="96F231E0"/>
+    <w:lvl w:ilvl="0">
+      <w:start w:val="1"/>
+      <w:numFmt w:val="bullet"/>
+      <w:lvlText w:val=""/>
+      <w:lvlJc w:val="left"/>
+      <w:pPr>
+        <w:tabs>
+          <w:tab w:val="num" w:pos="720"/>
+        </w:tabs>
+        <w:ind w:left="720" w:hanging="360"/>
+      </w:pPr>
+      <w:rPr>
+        <w:rFonts w:ascii="Symbol" w:hAnsi="Symbol" w:hint="default"/>
+        <w:sz w:val="20"/>
+      </w:rPr>
+    </w:lvl>
+    <w:lvl w:ilvl="1" w:tentative="1">
+      <w:start w:val="1"/>
+      <w:numFmt w:val="bullet"/>
+      <w:lvlText w:val="o"/>
+      <w:lvlJc w:val="left"/>
+      <w:pPr>
+        <w:tabs>
+          <w:tab w:val="num" w:pos="1440"/>
+        </w:tabs>
+        <w:ind w:left="1440" w:hanging="360"/>
+      </w:pPr>
+      <w:rPr>
+        <w:rFonts w:ascii="Courier New" w:hAnsi="Courier New" w:hint="default"/>
+        <w:sz w:val="20"/>
+      </w:rPr>
+    </w:lvl>
+    <w:lvl w:ilvl="2" w:tentative="1">
+      <w:start w:val="1"/>
+      <w:numFmt w:val="bullet"/>
+      <w:lvlText w:val=""/>
+      <w:lvlJc w:val="left"/>
+      <w:pPr>
+        <w:tabs>
+          <w:tab w:val="num" w:pos="2160"/>
+        </w:tabs>
+        <w:ind w:left="2160" w:hanging="360"/>
+      </w:pPr>
+      <w:rPr>
+        <w:rFonts w:ascii="Wingdings" w:hAnsi="Wingdings" w:hint="default"/>
+        <w:sz w:val="20"/>
+      </w:rPr>
+    </w:lvl>
+    <w:lvl w:ilvl="3" w:tentative="1">
+      <w:start w:val="1"/>
+      <w:numFmt w:val="bullet"/>
+      <w:lvlText w:val=""/>
+      <w:lvlJc w:val="left"/>
+      <w:pPr>
+        <w:tabs>
+          <w:tab w:val="num" w:pos="2880"/>
+        </w:tabs>
+        <w:ind w:left="2880" w:hanging="360"/>
+      </w:pPr>
+      <w:rPr>
+        <w:rFonts w:ascii="Wingdings" w:hAnsi="Wingdings" w:hint="default"/>
+        <w:sz w:val="20"/>
+      </w:rPr>
+    </w:lvl>
+    <w:lvl w:ilvl="4" w:tentative="1">
+      <w:start w:val="1"/>
+      <w:numFmt w:val="bullet"/>
+      <w:lvlText w:val=""/>
+      <w:lvlJc w:val="left"/>
+      <w:pPr>
+        <w:tabs>
+          <w:tab w:val="num" w:pos="3600"/>
+        </w:tabs>
+        <w:ind w:left="3600" w:hanging="360"/>
+      </w:pPr>
+      <w:rPr>
+        <w:rFonts w:ascii="Wingdings" w:hAnsi="Wingdings" w:hint="default"/>
+        <w:sz w:val="20"/>
+      </w:rPr>
+    </w:lvl>
+    <w:lvl w:ilvl="5" w:tentative="1">
+      <w:start w:val="1"/>
+      <w:numFmt w:val="bullet"/>
+      <w:lvlText w:val=""/>
+      <w:lvlJc w:val="left"/>
+      <w:pPr>
+        <w:tabs>
+          <w:tab w:val="num" w:pos="4320"/>
+        </w:tabs>
+        <w:ind w:left="4320" w:hanging="360"/>
+      </w:pPr>
+      <w:rPr>
+        <w:rFonts w:ascii="Wingdings" w:hAnsi="Wingdings" w:hint="default"/>
+        <w:sz w:val="20"/>
+      </w:rPr>
+    </w:lvl>
+    <w:lvl w:ilvl="6" w:tentative="1">
+      <w:start w:val="1"/>
+      <w:numFmt w:val="bullet"/>
+      <w:lvlText w:val=""/>
+      <w:lvlJc w:val="left"/>
+      <w:pPr>
+        <w:tabs>
+          <w:tab w:val="num" w:pos="5040"/>
+        </w:tabs>
+        <w:ind w:left="5040" w:hanging="360"/>
+      </w:pPr>
+      <w:rPr>
+        <w:rFonts w:ascii="Wingdings" w:hAnsi="Wingdings" w:hint="default"/>
+        <w:sz w:val="20"/>
+      </w:rPr>
+    </w:lvl>
+    <w:lvl w:ilvl="7" w:tentative="1">
+      <w:start w:val="1"/>
+      <w:numFmt w:val="bullet"/>
+      <w:lvlText w:val=""/>
+      <w:lvlJc w:val="left"/>
+      <w:pPr>
+        <w:tabs>
+          <w:tab w:val="num" w:pos="5760"/>
+        </w:tabs>
+        <w:ind w:left="5760" w:hanging="360"/>
+      </w:pPr>
+      <w:rPr>
+        <w:rFonts w:ascii="Wingdings" w:hAnsi="Wingdings" w:hint="default"/>
+        <w:sz w:val="20"/>
+      </w:rPr>
+    </w:lvl>
+    <w:lvl w:ilvl="8" w:tentative="1">
+      <w:start w:val="1"/>
+      <w:numFmt w:val="bullet"/>
+      <w:lvlText w:val=""/>
+      <w:lvlJc w:val="left"/>
+      <w:pPr>
+        <w:tabs>
+          <w:tab w:val="num" w:pos="6480"/>
+        </w:tabs>
+        <w:ind w:left="6480" w:hanging="360"/>
+      </w:pPr>
+      <w:rPr>
+        <w:rFonts w:ascii="Wingdings" w:hAnsi="Wingdings" w:hint="default"/>
+        <w:sz w:val="20"/>
+      </w:rPr>
+    </w:lvl>
+  </w:abstractNum>
+  <w:abstractNum w:abstractNumId="12" w15:restartNumberingAfterBreak="0">
+    <w:nsid w:val="49D53317"/>
+    <w:multiLevelType w:val="multilevel"/>
+    <w:tmpl w:val="554227C4"/>
+    <w:lvl w:ilvl="0">
+      <w:start w:val="1"/>
+      <w:numFmt w:val="bullet"/>
+      <w:lvlText w:val=""/>
+      <w:lvlJc w:val="left"/>
+      <w:pPr>
+        <w:tabs>
+          <w:tab w:val="num" w:pos="720"/>
+        </w:tabs>
+        <w:ind w:left="720" w:hanging="360"/>
+      </w:pPr>
+      <w:rPr>
+        <w:rFonts w:ascii="Symbol" w:hAnsi="Symbol" w:hint="default"/>
+        <w:sz w:val="20"/>
+      </w:rPr>
+    </w:lvl>
+    <w:lvl w:ilvl="1" w:tentative="1">
+      <w:start w:val="1"/>
+      <w:numFmt w:val="bullet"/>
+      <w:lvlText w:val="o"/>
+      <w:lvlJc w:val="left"/>
+      <w:pPr>
+        <w:tabs>
+          <w:tab w:val="num" w:pos="1440"/>
+        </w:tabs>
+        <w:ind w:left="1440" w:hanging="360"/>
+      </w:pPr>
+      <w:rPr>
+        <w:rFonts w:ascii="Courier New" w:hAnsi="Courier New" w:hint="default"/>
+        <w:sz w:val="20"/>
+      </w:rPr>
+    </w:lvl>
+    <w:lvl w:ilvl="2" w:tentative="1">
+      <w:start w:val="1"/>
+      <w:numFmt w:val="bullet"/>
+      <w:lvlText w:val=""/>
+      <w:lvlJc w:val="left"/>
+      <w:pPr>
+        <w:tabs>
+          <w:tab w:val="num" w:pos="2160"/>
+        </w:tabs>
+        <w:ind w:left="2160" w:hanging="360"/>
+      </w:pPr>
+      <w:rPr>
+        <w:rFonts w:ascii="Wingdings" w:hAnsi="Wingdings" w:hint="default"/>
+        <w:sz w:val="20"/>
+      </w:rPr>
+    </w:lvl>
+    <w:lvl w:ilvl="3" w:tentative="1">
+      <w:start w:val="1"/>
+      <w:numFmt w:val="bullet"/>
+      <w:lvlText w:val=""/>
+      <w:lvlJc w:val="left"/>
+      <w:pPr>
+        <w:tabs>
+          <w:tab w:val="num" w:pos="2880"/>
+        </w:tabs>
+        <w:ind w:left="2880" w:hanging="360"/>
+      </w:pPr>
+      <w:rPr>
+        <w:rFonts w:ascii="Wingdings" w:hAnsi="Wingdings" w:hint="default"/>
+        <w:sz w:val="20"/>
+      </w:rPr>
+    </w:lvl>
+    <w:lvl w:ilvl="4" w:tentative="1">
+      <w:start w:val="1"/>
+      <w:numFmt w:val="bullet"/>
+      <w:lvlText w:val=""/>
+      <w:lvlJc w:val="left"/>
+      <w:pPr>
+        <w:tabs>
+          <w:tab w:val="num" w:pos="3600"/>
+        </w:tabs>
+        <w:ind w:left="3600" w:hanging="360"/>
+      </w:pPr>
+      <w:rPr>
+        <w:rFonts w:ascii="Wingdings" w:hAnsi="Wingdings" w:hint="default"/>
+        <w:sz w:val="20"/>
+      </w:rPr>
+    </w:lvl>
+    <w:lvl w:ilvl="5" w:tentative="1">
+      <w:start w:val="1"/>
+      <w:numFmt w:val="bullet"/>
+      <w:lvlText w:val=""/>
+      <w:lvlJc w:val="left"/>
+      <w:pPr>
+        <w:tabs>
+          <w:tab w:val="num" w:pos="4320"/>
+        </w:tabs>
+        <w:ind w:left="4320" w:hanging="360"/>
+      </w:pPr>
+      <w:rPr>
+        <w:rFonts w:ascii="Wingdings" w:hAnsi="Wingdings" w:hint="default"/>
+        <w:sz w:val="20"/>
+      </w:rPr>
+    </w:lvl>
+    <w:lvl w:ilvl="6" w:tentative="1">
+      <w:start w:val="1"/>
+      <w:numFmt w:val="bullet"/>
+      <w:lvlText w:val=""/>
+      <w:lvlJc w:val="left"/>
+      <w:pPr>
+        <w:tabs>
+          <w:tab w:val="num" w:pos="5040"/>
+        </w:tabs>
+        <w:ind w:left="5040" w:hanging="360"/>
+      </w:pPr>
+      <w:rPr>
+        <w:rFonts w:ascii="Wingdings" w:hAnsi="Wingdings" w:hint="default"/>
+        <w:sz w:val="20"/>
+      </w:rPr>
+    </w:lvl>
+    <w:lvl w:ilvl="7" w:tentative="1">
+      <w:start w:val="1"/>
+      <w:numFmt w:val="bullet"/>
+      <w:lvlText w:val=""/>
+      <w:lvlJc w:val="left"/>
+      <w:pPr>
+        <w:tabs>
+          <w:tab w:val="num" w:pos="5760"/>
+        </w:tabs>
+        <w:ind w:left="5760" w:hanging="360"/>
+      </w:pPr>
+      <w:rPr>
+        <w:rFonts w:ascii="Wingdings" w:hAnsi="Wingdings" w:hint="default"/>
+        <w:sz w:val="20"/>
+      </w:rPr>
+    </w:lvl>
+    <w:lvl w:ilvl="8" w:tentative="1">
+      <w:start w:val="1"/>
+      <w:numFmt w:val="bullet"/>
+      <w:lvlText w:val=""/>
+      <w:lvlJc w:val="left"/>
+      <w:pPr>
+        <w:tabs>
+          <w:tab w:val="num" w:pos="6480"/>
+        </w:tabs>
+        <w:ind w:left="6480" w:hanging="360"/>
+      </w:pPr>
+      <w:rPr>
+        <w:rFonts w:ascii="Wingdings" w:hAnsi="Wingdings" w:hint="default"/>
+        <w:sz w:val="20"/>
+      </w:rPr>
+    </w:lvl>
+  </w:abstractNum>
+  <w:abstractNum w:abstractNumId="13" w15:restartNumberingAfterBreak="0">
+    <w:nsid w:val="4AA9063B"/>
+    <w:multiLevelType w:val="multilevel"/>
+    <w:tmpl w:val="8880FE66"/>
+    <w:lvl w:ilvl="0">
+      <w:start w:val="1"/>
+      <w:numFmt w:val="bullet"/>
+      <w:lvlText w:val=""/>
+      <w:lvlJc w:val="left"/>
+      <w:pPr>
+        <w:tabs>
+          <w:tab w:val="num" w:pos="720"/>
+        </w:tabs>
+        <w:ind w:left="720" w:hanging="360"/>
+      </w:pPr>
+      <w:rPr>
+        <w:rFonts w:ascii="Symbol" w:hAnsi="Symbol" w:hint="default"/>
+        <w:sz w:val="20"/>
+      </w:rPr>
+    </w:lvl>
+    <w:lvl w:ilvl="1">
+      <w:start w:val="1"/>
+      <w:numFmt w:val="bullet"/>
+      <w:lvlText w:val="o"/>
+      <w:lvlJc w:val="left"/>
+      <w:pPr>
+        <w:tabs>
+          <w:tab w:val="num" w:pos="1440"/>
+        </w:tabs>
+        <w:ind w:left="1440" w:hanging="360"/>
+      </w:pPr>
+      <w:rPr>
+        <w:rFonts w:ascii="Courier New" w:hAnsi="Courier New" w:hint="default"/>
+        <w:sz w:val="20"/>
+      </w:rPr>
+    </w:lvl>
+    <w:lvl w:ilvl="2" w:tentative="1">
+      <w:start w:val="1"/>
+      <w:numFmt w:val="bullet"/>
+      <w:lvlText w:val=""/>
+      <w:lvlJc w:val="left"/>
+      <w:pPr>
+        <w:tabs>
+          <w:tab w:val="num" w:pos="2160"/>
+        </w:tabs>
+        <w:ind w:left="2160" w:hanging="360"/>
+      </w:pPr>
+      <w:rPr>
+        <w:rFonts w:ascii="Wingdings" w:hAnsi="Wingdings" w:hint="default"/>
+        <w:sz w:val="20"/>
+      </w:rPr>
+    </w:lvl>
+    <w:lvl w:ilvl="3" w:tentative="1">
+      <w:start w:val="1"/>
+      <w:numFmt w:val="bullet"/>
+      <w:lvlText w:val=""/>
+      <w:lvlJc w:val="left"/>
+      <w:pPr>
+        <w:tabs>
+          <w:tab w:val="num" w:pos="2880"/>
+        </w:tabs>
+        <w:ind w:left="2880" w:hanging="360"/>
+      </w:pPr>
+      <w:rPr>
+        <w:rFonts w:ascii="Wingdings" w:hAnsi="Wingdings" w:hint="default"/>
+        <w:sz w:val="20"/>
+      </w:rPr>
+    </w:lvl>
+    <w:lvl w:ilvl="4" w:tentative="1">
+      <w:start w:val="1"/>
+      <w:numFmt w:val="bullet"/>
+      <w:lvlText w:val=""/>
+      <w:lvlJc w:val="left"/>
+      <w:pPr>
+        <w:tabs>
+          <w:tab w:val="num" w:pos="3600"/>
+        </w:tabs>
+        <w:ind w:left="3600" w:hanging="360"/>
+      </w:pPr>
+      <w:rPr>
+        <w:rFonts w:ascii="Wingdings" w:hAnsi="Wingdings" w:hint="default"/>
+        <w:sz w:val="20"/>
+      </w:rPr>
+    </w:lvl>
+    <w:lvl w:ilvl="5" w:tentative="1">
+      <w:start w:val="1"/>
+      <w:numFmt w:val="bullet"/>
+      <w:lvlText w:val=""/>
+      <w:lvlJc w:val="left"/>
+      <w:pPr>
+        <w:tabs>
+          <w:tab w:val="num" w:pos="4320"/>
+        </w:tabs>
+        <w:ind w:left="4320" w:hanging="360"/>
+      </w:pPr>
+      <w:rPr>
+        <w:rFonts w:ascii="Wingdings" w:hAnsi="Wingdings" w:hint="default"/>
+        <w:sz w:val="20"/>
+      </w:rPr>
+    </w:lvl>
+    <w:lvl w:ilvl="6" w:tentative="1">
+      <w:start w:val="1"/>
+      <w:numFmt w:val="bullet"/>
+      <w:lvlText w:val=""/>
+      <w:lvlJc w:val="left"/>
+      <w:pPr>
+        <w:tabs>
+          <w:tab w:val="num" w:pos="5040"/>
+        </w:tabs>
+        <w:ind w:left="5040" w:hanging="360"/>
+      </w:pPr>
+      <w:rPr>
+        <w:rFonts w:ascii="Wingdings" w:hAnsi="Wingdings" w:hint="default"/>
+        <w:sz w:val="20"/>
+      </w:rPr>
+    </w:lvl>
+    <w:lvl w:ilvl="7" w:tentative="1">
+      <w:start w:val="1"/>
+      <w:numFmt w:val="bullet"/>
+      <w:lvlText w:val=""/>
+      <w:lvlJc w:val="left"/>
+      <w:pPr>
+        <w:tabs>
+          <w:tab w:val="num" w:pos="5760"/>
+        </w:tabs>
+        <w:ind w:left="5760" w:hanging="360"/>
+      </w:pPr>
+      <w:rPr>
+        <w:rFonts w:ascii="Wingdings" w:hAnsi="Wingdings" w:hint="default"/>
+        <w:sz w:val="20"/>
+      </w:rPr>
+    </w:lvl>
+    <w:lvl w:ilvl="8" w:tentative="1">
+      <w:start w:val="1"/>
+      <w:numFmt w:val="bullet"/>
+      <w:lvlText w:val=""/>
+      <w:lvlJc w:val="left"/>
+      <w:pPr>
+        <w:tabs>
+          <w:tab w:val="num" w:pos="6480"/>
+        </w:tabs>
+        <w:ind w:left="6480" w:hanging="360"/>
+      </w:pPr>
+      <w:rPr>
+        <w:rFonts w:ascii="Wingdings" w:hAnsi="Wingdings" w:hint="default"/>
+        <w:sz w:val="20"/>
+      </w:rPr>
+    </w:lvl>
+  </w:abstractNum>
+  <w:abstractNum w:abstractNumId="14" w15:restartNumberingAfterBreak="0">
+    <w:nsid w:val="4D78314F"/>
+    <w:multiLevelType w:val="multilevel"/>
+    <w:tmpl w:val="CA944C36"/>
+    <w:lvl w:ilvl="0">
+      <w:start w:val="1"/>
+      <w:numFmt w:val="bullet"/>
+      <w:lvlText w:val=""/>
+      <w:lvlJc w:val="left"/>
+      <w:pPr>
+        <w:tabs>
+          <w:tab w:val="num" w:pos="720"/>
+        </w:tabs>
+        <w:ind w:left="720" w:hanging="360"/>
+      </w:pPr>
+      <w:rPr>
+        <w:rFonts w:ascii="Symbol" w:hAnsi="Symbol" w:hint="default"/>
+        <w:sz w:val="20"/>
+      </w:rPr>
+    </w:lvl>
+    <w:lvl w:ilvl="1" w:tentative="1">
+      <w:start w:val="1"/>
+      <w:numFmt w:val="bullet"/>
+      <w:lvlText w:val="o"/>
+      <w:lvlJc w:val="left"/>
+      <w:pPr>
+        <w:tabs>
+          <w:tab w:val="num" w:pos="1440"/>
+        </w:tabs>
+        <w:ind w:left="1440" w:hanging="360"/>
+      </w:pPr>
+      <w:rPr>
+        <w:rFonts w:ascii="Courier New" w:hAnsi="Courier New" w:hint="default"/>
+        <w:sz w:val="20"/>
+      </w:rPr>
+    </w:lvl>
+    <w:lvl w:ilvl="2" w:tentative="1">
+      <w:start w:val="1"/>
+      <w:numFmt w:val="bullet"/>
+      <w:lvlText w:val=""/>
+      <w:lvlJc w:val="left"/>
+      <w:pPr>
+        <w:tabs>
+          <w:tab w:val="num" w:pos="2160"/>
+        </w:tabs>
+        <w:ind w:left="2160" w:hanging="360"/>
+      </w:pPr>
+      <w:rPr>
+        <w:rFonts w:ascii="Wingdings" w:hAnsi="Wingdings" w:hint="default"/>
+        <w:sz w:val="20"/>
+      </w:rPr>
+    </w:lvl>
+    <w:lvl w:ilvl="3" w:tentative="1">
+      <w:start w:val="1"/>
+      <w:numFmt w:val="bullet"/>
+      <w:lvlText w:val=""/>
+      <w:lvlJc w:val="left"/>
+      <w:pPr>
+        <w:tabs>
+          <w:tab w:val="num" w:pos="2880"/>
+        </w:tabs>
+        <w:ind w:left="2880" w:hanging="360"/>
+      </w:pPr>
+      <w:rPr>
+        <w:rFonts w:ascii="Wingdings" w:hAnsi="Wingdings" w:hint="default"/>
+        <w:sz w:val="20"/>
+      </w:rPr>
+    </w:lvl>
+    <w:lvl w:ilvl="4" w:tentative="1">
+      <w:start w:val="1"/>
+      <w:numFmt w:val="bullet"/>
+      <w:lvlText w:val=""/>
+      <w:lvlJc w:val="left"/>
+      <w:pPr>
+        <w:tabs>
+          <w:tab w:val="num" w:pos="3600"/>
+        </w:tabs>
+        <w:ind w:left="3600" w:hanging="360"/>
+      </w:pPr>
+      <w:rPr>
+        <w:rFonts w:ascii="Wingdings" w:hAnsi="Wingdings" w:hint="default"/>
+        <w:sz w:val="20"/>
+      </w:rPr>
+    </w:lvl>
+    <w:lvl w:ilvl="5" w:tentative="1">
+      <w:start w:val="1"/>
+      <w:numFmt w:val="bullet"/>
+      <w:lvlText w:val=""/>
+      <w:lvlJc w:val="left"/>
+      <w:pPr>
+        <w:tabs>
+          <w:tab w:val="num" w:pos="4320"/>
+        </w:tabs>
+        <w:ind w:left="4320" w:hanging="360"/>
+      </w:pPr>
+      <w:rPr>
+        <w:rFonts w:ascii="Wingdings" w:hAnsi="Wingdings" w:hint="default"/>
+        <w:sz w:val="20"/>
+      </w:rPr>
+    </w:lvl>
+    <w:lvl w:ilvl="6" w:tentative="1">
+      <w:start w:val="1"/>
+      <w:numFmt w:val="bullet"/>
+      <w:lvlText w:val=""/>
+      <w:lvlJc w:val="left"/>
+      <w:pPr>
+        <w:tabs>
+          <w:tab w:val="num" w:pos="5040"/>
+        </w:tabs>
+        <w:ind w:left="5040" w:hanging="360"/>
+      </w:pPr>
+      <w:rPr>
+        <w:rFonts w:ascii="Wingdings" w:hAnsi="Wingdings" w:hint="default"/>
+        <w:sz w:val="20"/>
+      </w:rPr>
+    </w:lvl>
+    <w:lvl w:ilvl="7" w:tentative="1">
+      <w:start w:val="1"/>
+      <w:numFmt w:val="bullet"/>
+      <w:lvlText w:val=""/>
+      <w:lvlJc w:val="left"/>
+      <w:pPr>
+        <w:tabs>
+          <w:tab w:val="num" w:pos="5760"/>
+        </w:tabs>
+        <w:ind w:left="5760" w:hanging="360"/>
+      </w:pPr>
+      <w:rPr>
+        <w:rFonts w:ascii="Wingdings" w:hAnsi="Wingdings" w:hint="default"/>
+        <w:sz w:val="20"/>
+      </w:rPr>
+    </w:lvl>
+    <w:lvl w:ilvl="8" w:tentative="1">
+      <w:start w:val="1"/>
+      <w:numFmt w:val="bullet"/>
+      <w:lvlText w:val=""/>
+      <w:lvlJc w:val="left"/>
+      <w:pPr>
+        <w:tabs>
+          <w:tab w:val="num" w:pos="6480"/>
+        </w:tabs>
+        <w:ind w:left="6480" w:hanging="360"/>
+      </w:pPr>
+      <w:rPr>
+        <w:rFonts w:ascii="Wingdings" w:hAnsi="Wingdings" w:hint="default"/>
+        <w:sz w:val="20"/>
+      </w:rPr>
+    </w:lvl>
+  </w:abstractNum>
+  <w:abstractNum w:abstractNumId="15" w15:restartNumberingAfterBreak="0">
+    <w:nsid w:val="530701AB"/>
+    <w:multiLevelType w:val="multilevel"/>
+    <w:tmpl w:val="47EC8A76"/>
+    <w:lvl w:ilvl="0">
+      <w:start w:val="1"/>
+      <w:numFmt w:val="bullet"/>
+      <w:lvlText w:val=""/>
+      <w:lvlJc w:val="left"/>
+      <w:pPr>
+        <w:tabs>
+          <w:tab w:val="num" w:pos="720"/>
+        </w:tabs>
+        <w:ind w:left="720" w:hanging="360"/>
+      </w:pPr>
+      <w:rPr>
+        <w:rFonts w:ascii="Symbol" w:hAnsi="Symbol" w:hint="default"/>
+        <w:sz w:val="20"/>
+      </w:rPr>
+    </w:lvl>
+    <w:lvl w:ilvl="1" w:tentative="1">
+      <w:start w:val="1"/>
+      <w:numFmt w:val="bullet"/>
+      <w:lvlText w:val="o"/>
+      <w:lvlJc w:val="left"/>
+      <w:pPr>
+        <w:tabs>
+          <w:tab w:val="num" w:pos="1440"/>
+        </w:tabs>
+        <w:ind w:left="1440" w:hanging="360"/>
+      </w:pPr>
+      <w:rPr>
+        <w:rFonts w:ascii="Courier New" w:hAnsi="Courier New" w:hint="default"/>
+        <w:sz w:val="20"/>
+      </w:rPr>
+    </w:lvl>
+    <w:lvl w:ilvl="2" w:tentative="1">
+      <w:start w:val="1"/>
+      <w:numFmt w:val="bullet"/>
+      <w:lvlText w:val=""/>
+      <w:lvlJc w:val="left"/>
+      <w:pPr>
+        <w:tabs>
+          <w:tab w:val="num" w:pos="2160"/>
+        </w:tabs>
+        <w:ind w:left="2160" w:hanging="360"/>
+      </w:pPr>
+      <w:rPr>
+        <w:rFonts w:ascii="Wingdings" w:hAnsi="Wingdings" w:hint="default"/>
+        <w:sz w:val="20"/>
+      </w:rPr>
+    </w:lvl>
+    <w:lvl w:ilvl="3" w:tentative="1">
+      <w:start w:val="1"/>
+      <w:numFmt w:val="bullet"/>
+      <w:lvlText w:val=""/>
+      <w:lvlJc w:val="left"/>
+      <w:pPr>
+        <w:tabs>
+          <w:tab w:val="num" w:pos="2880"/>
+        </w:tabs>
+        <w:ind w:left="2880" w:hanging="360"/>
+      </w:pPr>
+      <w:rPr>
+        <w:rFonts w:ascii="Wingdings" w:hAnsi="Wingdings" w:hint="default"/>
+        <w:sz w:val="20"/>
+      </w:rPr>
+    </w:lvl>
+    <w:lvl w:ilvl="4" w:tentative="1">
+      <w:start w:val="1"/>
+      <w:numFmt w:val="bullet"/>
+      <w:lvlText w:val=""/>
+      <w:lvlJc w:val="left"/>
+      <w:pPr>
+        <w:tabs>
+          <w:tab w:val="num" w:pos="3600"/>
+        </w:tabs>
+        <w:ind w:left="3600" w:hanging="360"/>
+      </w:pPr>
+      <w:rPr>
+        <w:rFonts w:ascii="Wingdings" w:hAnsi="Wingdings" w:hint="default"/>
+        <w:sz w:val="20"/>
+      </w:rPr>
+    </w:lvl>
+    <w:lvl w:ilvl="5" w:tentative="1">
+      <w:start w:val="1"/>
+      <w:numFmt w:val="bullet"/>
+      <w:lvlText w:val=""/>
+      <w:lvlJc w:val="left"/>
+      <w:pPr>
+        <w:tabs>
+          <w:tab w:val="num" w:pos="4320"/>
+        </w:tabs>
+        <w:ind w:left="4320" w:hanging="360"/>
+      </w:pPr>
+      <w:rPr>
+        <w:rFonts w:ascii="Wingdings" w:hAnsi="Wingdings" w:hint="default"/>
+        <w:sz w:val="20"/>
+      </w:rPr>
+    </w:lvl>
+    <w:lvl w:ilvl="6" w:tentative="1">
+      <w:start w:val="1"/>
+      <w:numFmt w:val="bullet"/>
+      <w:lvlText w:val=""/>
+      <w:lvlJc w:val="left"/>
+      <w:pPr>
+        <w:tabs>
+          <w:tab w:val="num" w:pos="5040"/>
+        </w:tabs>
+        <w:ind w:left="5040" w:hanging="360"/>
+      </w:pPr>
+      <w:rPr>
+        <w:rFonts w:ascii="Wingdings" w:hAnsi="Wingdings" w:hint="default"/>
+        <w:sz w:val="20"/>
+      </w:rPr>
+    </w:lvl>
+    <w:lvl w:ilvl="7" w:tentative="1">
+      <w:start w:val="1"/>
+      <w:numFmt w:val="bullet"/>
+      <w:lvlText w:val=""/>
+      <w:lvlJc w:val="left"/>
+      <w:pPr>
+        <w:tabs>
+          <w:tab w:val="num" w:pos="5760"/>
+        </w:tabs>
+        <w:ind w:left="5760" w:hanging="360"/>
+      </w:pPr>
+      <w:rPr>
+        <w:rFonts w:ascii="Wingdings" w:hAnsi="Wingdings" w:hint="default"/>
+        <w:sz w:val="20"/>
+      </w:rPr>
+    </w:lvl>
+    <w:lvl w:ilvl="8" w:tentative="1">
+      <w:start w:val="1"/>
+      <w:numFmt w:val="bullet"/>
+      <w:lvlText w:val=""/>
+      <w:lvlJc w:val="left"/>
+      <w:pPr>
+        <w:tabs>
+          <w:tab w:val="num" w:pos="6480"/>
+        </w:tabs>
+        <w:ind w:left="6480" w:hanging="360"/>
+      </w:pPr>
+      <w:rPr>
+        <w:rFonts w:ascii="Wingdings" w:hAnsi="Wingdings" w:hint="default"/>
+        <w:sz w:val="20"/>
+      </w:rPr>
+    </w:lvl>
+  </w:abstractNum>
+  <w:abstractNum w:abstractNumId="16" w15:restartNumberingAfterBreak="0">
+    <w:nsid w:val="55527108"/>
+    <w:multiLevelType w:val="multilevel"/>
+    <w:tmpl w:val="FB0A5616"/>
+    <w:lvl w:ilvl="0">
+      <w:start w:val="1"/>
+      <w:numFmt w:val="bullet"/>
+      <w:lvlText w:val=""/>
+      <w:lvlJc w:val="left"/>
+      <w:pPr>
+        <w:tabs>
+          <w:tab w:val="num" w:pos="720"/>
+        </w:tabs>
+        <w:ind w:left="720" w:hanging="360"/>
+      </w:pPr>
+      <w:rPr>
+        <w:rFonts w:ascii="Symbol" w:hAnsi="Symbol" w:hint="default"/>
+        <w:sz w:val="20"/>
+      </w:rPr>
+    </w:lvl>
+    <w:lvl w:ilvl="1">
+      <w:start w:val="1"/>
+      <w:numFmt w:val="bullet"/>
+      <w:lvlText w:val="o"/>
+      <w:lvlJc w:val="left"/>
+      <w:pPr>
+        <w:tabs>
+          <w:tab w:val="num" w:pos="1440"/>
+        </w:tabs>
+        <w:ind w:left="1440" w:hanging="360"/>
+      </w:pPr>
+      <w:rPr>
+        <w:rFonts w:ascii="Courier New" w:hAnsi="Courier New" w:hint="default"/>
+        <w:sz w:val="20"/>
+      </w:rPr>
+    </w:lvl>
+    <w:lvl w:ilvl="2" w:tentative="1">
+      <w:start w:val="1"/>
+      <w:numFmt w:val="bullet"/>
+      <w:lvlText w:val=""/>
+      <w:lvlJc w:val="left"/>
+      <w:pPr>
+        <w:tabs>
+          <w:tab w:val="num" w:pos="2160"/>
+        </w:tabs>
+        <w:ind w:left="2160" w:hanging="360"/>
+      </w:pPr>
+      <w:rPr>
+        <w:rFonts w:ascii="Wingdings" w:hAnsi="Wingdings" w:hint="default"/>
+        <w:sz w:val="20"/>
+      </w:rPr>
+    </w:lvl>
+    <w:lvl w:ilvl="3" w:tentative="1">
+      <w:start w:val="1"/>
+      <w:numFmt w:val="bullet"/>
+      <w:lvlText w:val=""/>
+      <w:lvlJc w:val="left"/>
+      <w:pPr>
+        <w:tabs>
+          <w:tab w:val="num" w:pos="2880"/>
+        </w:tabs>
+        <w:ind w:left="2880" w:hanging="360"/>
+      </w:pPr>
+      <w:rPr>
+        <w:rFonts w:ascii="Wingdings" w:hAnsi="Wingdings" w:hint="default"/>
+        <w:sz w:val="20"/>
+      </w:rPr>
+    </w:lvl>
+    <w:lvl w:ilvl="4" w:tentative="1">
+      <w:start w:val="1"/>
+      <w:numFmt w:val="bullet"/>
+      <w:lvlText w:val=""/>
+      <w:lvlJc w:val="left"/>
+      <w:pPr>
+        <w:tabs>
+          <w:tab w:val="num" w:pos="3600"/>
+        </w:tabs>
+        <w:ind w:left="3600" w:hanging="360"/>
+      </w:pPr>
+      <w:rPr>
+        <w:rFonts w:ascii="Wingdings" w:hAnsi="Wingdings" w:hint="default"/>
+        <w:sz w:val="20"/>
+      </w:rPr>
+    </w:lvl>
+    <w:lvl w:ilvl="5" w:tentative="1">
+      <w:start w:val="1"/>
+      <w:numFmt w:val="bullet"/>
+      <w:lvlText w:val=""/>
+      <w:lvlJc w:val="left"/>
+      <w:pPr>
+        <w:tabs>
+          <w:tab w:val="num" w:pos="4320"/>
+        </w:tabs>
+        <w:ind w:left="4320" w:hanging="360"/>
+      </w:pPr>
+      <w:rPr>
+        <w:rFonts w:ascii="Wingdings" w:hAnsi="Wingdings" w:hint="default"/>
+        <w:sz w:val="20"/>
+      </w:rPr>
+    </w:lvl>
+    <w:lvl w:ilvl="6" w:tentative="1">
+      <w:start w:val="1"/>
+      <w:numFmt w:val="bullet"/>
+      <w:lvlText w:val=""/>
+      <w:lvlJc w:val="left"/>
+      <w:pPr>
+        <w:tabs>
+          <w:tab w:val="num" w:pos="5040"/>
+        </w:tabs>
+        <w:ind w:left="5040" w:hanging="360"/>
+      </w:pPr>
+      <w:rPr>
+        <w:rFonts w:ascii="Wingdings" w:hAnsi="Wingdings" w:hint="default"/>
+        <w:sz w:val="20"/>
+      </w:rPr>
+    </w:lvl>
+    <w:lvl w:ilvl="7" w:tentative="1">
+      <w:start w:val="1"/>
+      <w:numFmt w:val="bullet"/>
+      <w:lvlText w:val=""/>
+      <w:lvlJc w:val="left"/>
+      <w:pPr>
+        <w:tabs>
+          <w:tab w:val="num" w:pos="5760"/>
+        </w:tabs>
+        <w:ind w:left="5760" w:hanging="360"/>
+      </w:pPr>
+      <w:rPr>
+        <w:rFonts w:ascii="Wingdings" w:hAnsi="Wingdings" w:hint="default"/>
+        <w:sz w:val="20"/>
+      </w:rPr>
+    </w:lvl>
+    <w:lvl w:ilvl="8" w:tentative="1">
+      <w:start w:val="1"/>
+      <w:numFmt w:val="bullet"/>
+      <w:lvlText w:val=""/>
+      <w:lvlJc w:val="left"/>
+      <w:pPr>
+        <w:tabs>
+          <w:tab w:val="num" w:pos="6480"/>
+        </w:tabs>
+        <w:ind w:left="6480" w:hanging="360"/>
+      </w:pPr>
+      <w:rPr>
+        <w:rFonts w:ascii="Wingdings" w:hAnsi="Wingdings" w:hint="default"/>
+        <w:sz w:val="20"/>
+      </w:rPr>
+    </w:lvl>
+  </w:abstractNum>
+  <w:abstractNum w:abstractNumId="17" w15:restartNumberingAfterBreak="0">
+    <w:nsid w:val="661458D3"/>
+    <w:multiLevelType w:val="multilevel"/>
+    <w:tmpl w:val="C5C0D8D8"/>
+    <w:lvl w:ilvl="0">
+      <w:start w:val="1"/>
+      <w:numFmt w:val="bullet"/>
+      <w:lvlText w:val=""/>
+      <w:lvlJc w:val="left"/>
+      <w:pPr>
+        <w:tabs>
+          <w:tab w:val="num" w:pos="720"/>
+        </w:tabs>
+        <w:ind w:left="720" w:hanging="360"/>
+      </w:pPr>
+      <w:rPr>
+        <w:rFonts w:ascii="Symbol" w:hAnsi="Symbol" w:hint="default"/>
+        <w:sz w:val="20"/>
+      </w:rPr>
+    </w:lvl>
+    <w:lvl w:ilvl="1" w:tentative="1">
+      <w:start w:val="1"/>
+      <w:numFmt w:val="bullet"/>
+      <w:lvlText w:val="o"/>
+      <w:lvlJc w:val="left"/>
+      <w:pPr>
+        <w:tabs>
+          <w:tab w:val="num" w:pos="1440"/>
+        </w:tabs>
+        <w:ind w:left="1440" w:hanging="360"/>
+      </w:pPr>
+      <w:rPr>
+        <w:rFonts w:ascii="Courier New" w:hAnsi="Courier New" w:hint="default"/>
+        <w:sz w:val="20"/>
+      </w:rPr>
+    </w:lvl>
+    <w:lvl w:ilvl="2" w:tentative="1">
+      <w:start w:val="1"/>
+      <w:numFmt w:val="bullet"/>
+      <w:lvlText w:val=""/>
+      <w:lvlJc w:val="left"/>
+      <w:pPr>
+        <w:tabs>
+          <w:tab w:val="num" w:pos="2160"/>
+        </w:tabs>
+        <w:ind w:left="2160" w:hanging="360"/>
+      </w:pPr>
+      <w:rPr>
+        <w:rFonts w:ascii="Wingdings" w:hAnsi="Wingdings" w:hint="default"/>
+        <w:sz w:val="20"/>
+      </w:rPr>
+    </w:lvl>
+    <w:lvl w:ilvl="3" w:tentative="1">
+      <w:start w:val="1"/>
+      <w:numFmt w:val="bullet"/>
+      <w:lvlText w:val=""/>
+      <w:lvlJc w:val="left"/>
+      <w:pPr>
+        <w:tabs>
+          <w:tab w:val="num" w:pos="2880"/>
+        </w:tabs>
+        <w:ind w:left="2880" w:hanging="360"/>
+      </w:pPr>
+      <w:rPr>
+        <w:rFonts w:ascii="Wingdings" w:hAnsi="Wingdings" w:hint="default"/>
+        <w:sz w:val="20"/>
+      </w:rPr>
+    </w:lvl>
+    <w:lvl w:ilvl="4" w:tentative="1">
+      <w:start w:val="1"/>
+      <w:numFmt w:val="bullet"/>
+      <w:lvlText w:val=""/>
+      <w:lvlJc w:val="left"/>
+      <w:pPr>
+        <w:tabs>
+          <w:tab w:val="num" w:pos="3600"/>
+        </w:tabs>
+        <w:ind w:left="3600" w:hanging="360"/>
+      </w:pPr>
+      <w:rPr>
+        <w:rFonts w:ascii="Wingdings" w:hAnsi="Wingdings" w:hint="default"/>
+        <w:sz w:val="20"/>
+      </w:rPr>
+    </w:lvl>
+    <w:lvl w:ilvl="5" w:tentative="1">
+      <w:start w:val="1"/>
+      <w:numFmt w:val="bullet"/>
+      <w:lvlText w:val=""/>
+      <w:lvlJc w:val="left"/>
+      <w:pPr>
+        <w:tabs>
+          <w:tab w:val="num" w:pos="4320"/>
+        </w:tabs>
+        <w:ind w:left="4320" w:hanging="360"/>
+      </w:pPr>
+      <w:rPr>
+        <w:rFonts w:ascii="Wingdings" w:hAnsi="Wingdings" w:hint="default"/>
+        <w:sz w:val="20"/>
+      </w:rPr>
+    </w:lvl>
+    <w:lvl w:ilvl="6" w:tentative="1">
+      <w:start w:val="1"/>
+      <w:numFmt w:val="bullet"/>
+      <w:lvlText w:val=""/>
+      <w:lvlJc w:val="left"/>
+      <w:pPr>
+        <w:tabs>
+          <w:tab w:val="num" w:pos="5040"/>
+        </w:tabs>
+        <w:ind w:left="5040" w:hanging="360"/>
+      </w:pPr>
+      <w:rPr>
+        <w:rFonts w:ascii="Wingdings" w:hAnsi="Wingdings" w:hint="default"/>
+        <w:sz w:val="20"/>
+      </w:rPr>
+    </w:lvl>
+    <w:lvl w:ilvl="7" w:tentative="1">
+      <w:start w:val="1"/>
+      <w:numFmt w:val="bullet"/>
+      <w:lvlText w:val=""/>
+      <w:lvlJc w:val="left"/>
+      <w:pPr>
+        <w:tabs>
+          <w:tab w:val="num" w:pos="5760"/>
+        </w:tabs>
+        <w:ind w:left="5760" w:hanging="360"/>
+      </w:pPr>
+      <w:rPr>
+        <w:rFonts w:ascii="Wingdings" w:hAnsi="Wingdings" w:hint="default"/>
+        <w:sz w:val="20"/>
+      </w:rPr>
+    </w:lvl>
+    <w:lvl w:ilvl="8" w:tentative="1">
+      <w:start w:val="1"/>
+      <w:numFmt w:val="bullet"/>
+      <w:lvlText w:val=""/>
+      <w:lvlJc w:val="left"/>
+      <w:pPr>
+        <w:tabs>
+          <w:tab w:val="num" w:pos="6480"/>
+        </w:tabs>
+        <w:ind w:left="6480" w:hanging="360"/>
+      </w:pPr>
+      <w:rPr>
+        <w:rFonts w:ascii="Wingdings" w:hAnsi="Wingdings" w:hint="default"/>
+        <w:sz w:val="20"/>
+      </w:rPr>
+    </w:lvl>
+  </w:abstractNum>
+  <w:abstractNum w:abstractNumId="18" w15:restartNumberingAfterBreak="0">
     <w:nsid w:val="6900617D"/>
     <w:multiLevelType w:val="multilevel"/>
     <w:tmpl w:val="ACC0CAE2"/>
@@ -913,11 +3791,518 @@
       </w:rPr>
     </w:lvl>
   </w:abstractNum>
+  <w:abstractNum w:abstractNumId="19" w15:restartNumberingAfterBreak="0">
+    <w:nsid w:val="6A0A6116"/>
+    <w:multiLevelType w:val="multilevel"/>
+    <w:tmpl w:val="BB6A7048"/>
+    <w:lvl w:ilvl="0">
+      <w:start w:val="1"/>
+      <w:numFmt w:val="bullet"/>
+      <w:lvlText w:val=""/>
+      <w:lvlJc w:val="left"/>
+      <w:pPr>
+        <w:tabs>
+          <w:tab w:val="num" w:pos="720"/>
+        </w:tabs>
+        <w:ind w:left="720" w:hanging="360"/>
+      </w:pPr>
+      <w:rPr>
+        <w:rFonts w:ascii="Symbol" w:hAnsi="Symbol" w:hint="default"/>
+        <w:sz w:val="20"/>
+      </w:rPr>
+    </w:lvl>
+    <w:lvl w:ilvl="1" w:tentative="1">
+      <w:start w:val="1"/>
+      <w:numFmt w:val="bullet"/>
+      <w:lvlText w:val="o"/>
+      <w:lvlJc w:val="left"/>
+      <w:pPr>
+        <w:tabs>
+          <w:tab w:val="num" w:pos="1440"/>
+        </w:tabs>
+        <w:ind w:left="1440" w:hanging="360"/>
+      </w:pPr>
+      <w:rPr>
+        <w:rFonts w:ascii="Courier New" w:hAnsi="Courier New" w:hint="default"/>
+        <w:sz w:val="20"/>
+      </w:rPr>
+    </w:lvl>
+    <w:lvl w:ilvl="2" w:tentative="1">
+      <w:start w:val="1"/>
+      <w:numFmt w:val="bullet"/>
+      <w:lvlText w:val=""/>
+      <w:lvlJc w:val="left"/>
+      <w:pPr>
+        <w:tabs>
+          <w:tab w:val="num" w:pos="2160"/>
+        </w:tabs>
+        <w:ind w:left="2160" w:hanging="360"/>
+      </w:pPr>
+      <w:rPr>
+        <w:rFonts w:ascii="Wingdings" w:hAnsi="Wingdings" w:hint="default"/>
+        <w:sz w:val="20"/>
+      </w:rPr>
+    </w:lvl>
+    <w:lvl w:ilvl="3" w:tentative="1">
+      <w:start w:val="1"/>
+      <w:numFmt w:val="bullet"/>
+      <w:lvlText w:val=""/>
+      <w:lvlJc w:val="left"/>
+      <w:pPr>
+        <w:tabs>
+          <w:tab w:val="num" w:pos="2880"/>
+        </w:tabs>
+        <w:ind w:left="2880" w:hanging="360"/>
+      </w:pPr>
+      <w:rPr>
+        <w:rFonts w:ascii="Wingdings" w:hAnsi="Wingdings" w:hint="default"/>
+        <w:sz w:val="20"/>
+      </w:rPr>
+    </w:lvl>
+    <w:lvl w:ilvl="4" w:tentative="1">
+      <w:start w:val="1"/>
+      <w:numFmt w:val="bullet"/>
+      <w:lvlText w:val=""/>
+      <w:lvlJc w:val="left"/>
+      <w:pPr>
+        <w:tabs>
+          <w:tab w:val="num" w:pos="3600"/>
+        </w:tabs>
+        <w:ind w:left="3600" w:hanging="360"/>
+      </w:pPr>
+      <w:rPr>
+        <w:rFonts w:ascii="Wingdings" w:hAnsi="Wingdings" w:hint="default"/>
+        <w:sz w:val="20"/>
+      </w:rPr>
+    </w:lvl>
+    <w:lvl w:ilvl="5" w:tentative="1">
+      <w:start w:val="1"/>
+      <w:numFmt w:val="bullet"/>
+      <w:lvlText w:val=""/>
+      <w:lvlJc w:val="left"/>
+      <w:pPr>
+        <w:tabs>
+          <w:tab w:val="num" w:pos="4320"/>
+        </w:tabs>
+        <w:ind w:left="4320" w:hanging="360"/>
+      </w:pPr>
+      <w:rPr>
+        <w:rFonts w:ascii="Wingdings" w:hAnsi="Wingdings" w:hint="default"/>
+        <w:sz w:val="20"/>
+      </w:rPr>
+    </w:lvl>
+    <w:lvl w:ilvl="6" w:tentative="1">
+      <w:start w:val="1"/>
+      <w:numFmt w:val="bullet"/>
+      <w:lvlText w:val=""/>
+      <w:lvlJc w:val="left"/>
+      <w:pPr>
+        <w:tabs>
+          <w:tab w:val="num" w:pos="5040"/>
+        </w:tabs>
+        <w:ind w:left="5040" w:hanging="360"/>
+      </w:pPr>
+      <w:rPr>
+        <w:rFonts w:ascii="Wingdings" w:hAnsi="Wingdings" w:hint="default"/>
+        <w:sz w:val="20"/>
+      </w:rPr>
+    </w:lvl>
+    <w:lvl w:ilvl="7" w:tentative="1">
+      <w:start w:val="1"/>
+      <w:numFmt w:val="bullet"/>
+      <w:lvlText w:val=""/>
+      <w:lvlJc w:val="left"/>
+      <w:pPr>
+        <w:tabs>
+          <w:tab w:val="num" w:pos="5760"/>
+        </w:tabs>
+        <w:ind w:left="5760" w:hanging="360"/>
+      </w:pPr>
+      <w:rPr>
+        <w:rFonts w:ascii="Wingdings" w:hAnsi="Wingdings" w:hint="default"/>
+        <w:sz w:val="20"/>
+      </w:rPr>
+    </w:lvl>
+    <w:lvl w:ilvl="8" w:tentative="1">
+      <w:start w:val="1"/>
+      <w:numFmt w:val="bullet"/>
+      <w:lvlText w:val=""/>
+      <w:lvlJc w:val="left"/>
+      <w:pPr>
+        <w:tabs>
+          <w:tab w:val="num" w:pos="6480"/>
+        </w:tabs>
+        <w:ind w:left="6480" w:hanging="360"/>
+      </w:pPr>
+      <w:rPr>
+        <w:rFonts w:ascii="Wingdings" w:hAnsi="Wingdings" w:hint="default"/>
+        <w:sz w:val="20"/>
+      </w:rPr>
+    </w:lvl>
+  </w:abstractNum>
+  <w:abstractNum w:abstractNumId="20" w15:restartNumberingAfterBreak="0">
+    <w:nsid w:val="6D952BF9"/>
+    <w:multiLevelType w:val="multilevel"/>
+    <w:tmpl w:val="5882E6AC"/>
+    <w:lvl w:ilvl="0">
+      <w:start w:val="1"/>
+      <w:numFmt w:val="bullet"/>
+      <w:lvlText w:val=""/>
+      <w:lvlJc w:val="left"/>
+      <w:pPr>
+        <w:tabs>
+          <w:tab w:val="num" w:pos="720"/>
+        </w:tabs>
+        <w:ind w:left="720" w:hanging="360"/>
+      </w:pPr>
+      <w:rPr>
+        <w:rFonts w:ascii="Symbol" w:hAnsi="Symbol" w:hint="default"/>
+        <w:sz w:val="20"/>
+      </w:rPr>
+    </w:lvl>
+    <w:lvl w:ilvl="1" w:tentative="1">
+      <w:start w:val="1"/>
+      <w:numFmt w:val="bullet"/>
+      <w:lvlText w:val="o"/>
+      <w:lvlJc w:val="left"/>
+      <w:pPr>
+        <w:tabs>
+          <w:tab w:val="num" w:pos="1440"/>
+        </w:tabs>
+        <w:ind w:left="1440" w:hanging="360"/>
+      </w:pPr>
+      <w:rPr>
+        <w:rFonts w:ascii="Courier New" w:hAnsi="Courier New" w:hint="default"/>
+        <w:sz w:val="20"/>
+      </w:rPr>
+    </w:lvl>
+    <w:lvl w:ilvl="2" w:tentative="1">
+      <w:start w:val="1"/>
+      <w:numFmt w:val="bullet"/>
+      <w:lvlText w:val=""/>
+      <w:lvlJc w:val="left"/>
+      <w:pPr>
+        <w:tabs>
+          <w:tab w:val="num" w:pos="2160"/>
+        </w:tabs>
+        <w:ind w:left="2160" w:hanging="360"/>
+      </w:pPr>
+      <w:rPr>
+        <w:rFonts w:ascii="Wingdings" w:hAnsi="Wingdings" w:hint="default"/>
+        <w:sz w:val="20"/>
+      </w:rPr>
+    </w:lvl>
+    <w:lvl w:ilvl="3" w:tentative="1">
+      <w:start w:val="1"/>
+      <w:numFmt w:val="bullet"/>
+      <w:lvlText w:val=""/>
+      <w:lvlJc w:val="left"/>
+      <w:pPr>
+        <w:tabs>
+          <w:tab w:val="num" w:pos="2880"/>
+        </w:tabs>
+        <w:ind w:left="2880" w:hanging="360"/>
+      </w:pPr>
+      <w:rPr>
+        <w:rFonts w:ascii="Wingdings" w:hAnsi="Wingdings" w:hint="default"/>
+        <w:sz w:val="20"/>
+      </w:rPr>
+    </w:lvl>
+    <w:lvl w:ilvl="4" w:tentative="1">
+      <w:start w:val="1"/>
+      <w:numFmt w:val="bullet"/>
+      <w:lvlText w:val=""/>
+      <w:lvlJc w:val="left"/>
+      <w:pPr>
+        <w:tabs>
+          <w:tab w:val="num" w:pos="3600"/>
+        </w:tabs>
+        <w:ind w:left="3600" w:hanging="360"/>
+      </w:pPr>
+      <w:rPr>
+        <w:rFonts w:ascii="Wingdings" w:hAnsi="Wingdings" w:hint="default"/>
+        <w:sz w:val="20"/>
+      </w:rPr>
+    </w:lvl>
+    <w:lvl w:ilvl="5" w:tentative="1">
+      <w:start w:val="1"/>
+      <w:numFmt w:val="bullet"/>
+      <w:lvlText w:val=""/>
+      <w:lvlJc w:val="left"/>
+      <w:pPr>
+        <w:tabs>
+          <w:tab w:val="num" w:pos="4320"/>
+        </w:tabs>
+        <w:ind w:left="4320" w:hanging="360"/>
+      </w:pPr>
+      <w:rPr>
+        <w:rFonts w:ascii="Wingdings" w:hAnsi="Wingdings" w:hint="default"/>
+        <w:sz w:val="20"/>
+      </w:rPr>
+    </w:lvl>
+    <w:lvl w:ilvl="6" w:tentative="1">
+      <w:start w:val="1"/>
+      <w:numFmt w:val="bullet"/>
+      <w:lvlText w:val=""/>
+      <w:lvlJc w:val="left"/>
+      <w:pPr>
+        <w:tabs>
+          <w:tab w:val="num" w:pos="5040"/>
+        </w:tabs>
+        <w:ind w:left="5040" w:hanging="360"/>
+      </w:pPr>
+      <w:rPr>
+        <w:rFonts w:ascii="Wingdings" w:hAnsi="Wingdings" w:hint="default"/>
+        <w:sz w:val="20"/>
+      </w:rPr>
+    </w:lvl>
+    <w:lvl w:ilvl="7" w:tentative="1">
+      <w:start w:val="1"/>
+      <w:numFmt w:val="bullet"/>
+      <w:lvlText w:val=""/>
+      <w:lvlJc w:val="left"/>
+      <w:pPr>
+        <w:tabs>
+          <w:tab w:val="num" w:pos="5760"/>
+        </w:tabs>
+        <w:ind w:left="5760" w:hanging="360"/>
+      </w:pPr>
+      <w:rPr>
+        <w:rFonts w:ascii="Wingdings" w:hAnsi="Wingdings" w:hint="default"/>
+        <w:sz w:val="20"/>
+      </w:rPr>
+    </w:lvl>
+    <w:lvl w:ilvl="8" w:tentative="1">
+      <w:start w:val="1"/>
+      <w:numFmt w:val="bullet"/>
+      <w:lvlText w:val=""/>
+      <w:lvlJc w:val="left"/>
+      <w:pPr>
+        <w:tabs>
+          <w:tab w:val="num" w:pos="6480"/>
+        </w:tabs>
+        <w:ind w:left="6480" w:hanging="360"/>
+      </w:pPr>
+      <w:rPr>
+        <w:rFonts w:ascii="Wingdings" w:hAnsi="Wingdings" w:hint="default"/>
+        <w:sz w:val="20"/>
+      </w:rPr>
+    </w:lvl>
+  </w:abstractNum>
+  <w:abstractNum w:abstractNumId="21" w15:restartNumberingAfterBreak="0">
+    <w:nsid w:val="7413556F"/>
+    <w:multiLevelType w:val="multilevel"/>
+    <w:tmpl w:val="75A4B58A"/>
+    <w:lvl w:ilvl="0">
+      <w:start w:val="1"/>
+      <w:numFmt w:val="bullet"/>
+      <w:lvlText w:val=""/>
+      <w:lvlJc w:val="left"/>
+      <w:pPr>
+        <w:tabs>
+          <w:tab w:val="num" w:pos="720"/>
+        </w:tabs>
+        <w:ind w:left="720" w:hanging="360"/>
+      </w:pPr>
+      <w:rPr>
+        <w:rFonts w:ascii="Symbol" w:hAnsi="Symbol" w:hint="default"/>
+        <w:sz w:val="20"/>
+      </w:rPr>
+    </w:lvl>
+    <w:lvl w:ilvl="1" w:tentative="1">
+      <w:start w:val="1"/>
+      <w:numFmt w:val="bullet"/>
+      <w:lvlText w:val="o"/>
+      <w:lvlJc w:val="left"/>
+      <w:pPr>
+        <w:tabs>
+          <w:tab w:val="num" w:pos="1440"/>
+        </w:tabs>
+        <w:ind w:left="1440" w:hanging="360"/>
+      </w:pPr>
+      <w:rPr>
+        <w:rFonts w:ascii="Courier New" w:hAnsi="Courier New" w:hint="default"/>
+        <w:sz w:val="20"/>
+      </w:rPr>
+    </w:lvl>
+    <w:lvl w:ilvl="2" w:tentative="1">
+      <w:start w:val="1"/>
+      <w:numFmt w:val="bullet"/>
+      <w:lvlText w:val=""/>
+      <w:lvlJc w:val="left"/>
+      <w:pPr>
+        <w:tabs>
+          <w:tab w:val="num" w:pos="2160"/>
+        </w:tabs>
+        <w:ind w:left="2160" w:hanging="360"/>
+      </w:pPr>
+      <w:rPr>
+        <w:rFonts w:ascii="Wingdings" w:hAnsi="Wingdings" w:hint="default"/>
+        <w:sz w:val="20"/>
+      </w:rPr>
+    </w:lvl>
+    <w:lvl w:ilvl="3" w:tentative="1">
+      <w:start w:val="1"/>
+      <w:numFmt w:val="bullet"/>
+      <w:lvlText w:val=""/>
+      <w:lvlJc w:val="left"/>
+      <w:pPr>
+        <w:tabs>
+          <w:tab w:val="num" w:pos="2880"/>
+        </w:tabs>
+        <w:ind w:left="2880" w:hanging="360"/>
+      </w:pPr>
+      <w:rPr>
+        <w:rFonts w:ascii="Wingdings" w:hAnsi="Wingdings" w:hint="default"/>
+        <w:sz w:val="20"/>
+      </w:rPr>
+    </w:lvl>
+    <w:lvl w:ilvl="4" w:tentative="1">
+      <w:start w:val="1"/>
+      <w:numFmt w:val="bullet"/>
+      <w:lvlText w:val=""/>
+      <w:lvlJc w:val="left"/>
+      <w:pPr>
+        <w:tabs>
+          <w:tab w:val="num" w:pos="3600"/>
+        </w:tabs>
+        <w:ind w:left="3600" w:hanging="360"/>
+      </w:pPr>
+      <w:rPr>
+        <w:rFonts w:ascii="Wingdings" w:hAnsi="Wingdings" w:hint="default"/>
+        <w:sz w:val="20"/>
+      </w:rPr>
+    </w:lvl>
+    <w:lvl w:ilvl="5" w:tentative="1">
+      <w:start w:val="1"/>
+      <w:numFmt w:val="bullet"/>
+      <w:lvlText w:val=""/>
+      <w:lvlJc w:val="left"/>
+      <w:pPr>
+        <w:tabs>
+          <w:tab w:val="num" w:pos="4320"/>
+        </w:tabs>
+        <w:ind w:left="4320" w:hanging="360"/>
+      </w:pPr>
+      <w:rPr>
+        <w:rFonts w:ascii="Wingdings" w:hAnsi="Wingdings" w:hint="default"/>
+        <w:sz w:val="20"/>
+      </w:rPr>
+    </w:lvl>
+    <w:lvl w:ilvl="6" w:tentative="1">
+      <w:start w:val="1"/>
+      <w:numFmt w:val="bullet"/>
+      <w:lvlText w:val=""/>
+      <w:lvlJc w:val="left"/>
+      <w:pPr>
+        <w:tabs>
+          <w:tab w:val="num" w:pos="5040"/>
+        </w:tabs>
+        <w:ind w:left="5040" w:hanging="360"/>
+      </w:pPr>
+      <w:rPr>
+        <w:rFonts w:ascii="Wingdings" w:hAnsi="Wingdings" w:hint="default"/>
+        <w:sz w:val="20"/>
+      </w:rPr>
+    </w:lvl>
+    <w:lvl w:ilvl="7" w:tentative="1">
+      <w:start w:val="1"/>
+      <w:numFmt w:val="bullet"/>
+      <w:lvlText w:val=""/>
+      <w:lvlJc w:val="left"/>
+      <w:pPr>
+        <w:tabs>
+          <w:tab w:val="num" w:pos="5760"/>
+        </w:tabs>
+        <w:ind w:left="5760" w:hanging="360"/>
+      </w:pPr>
+      <w:rPr>
+        <w:rFonts w:ascii="Wingdings" w:hAnsi="Wingdings" w:hint="default"/>
+        <w:sz w:val="20"/>
+      </w:rPr>
+    </w:lvl>
+    <w:lvl w:ilvl="8" w:tentative="1">
+      <w:start w:val="1"/>
+      <w:numFmt w:val="bullet"/>
+      <w:lvlText w:val=""/>
+      <w:lvlJc w:val="left"/>
+      <w:pPr>
+        <w:tabs>
+          <w:tab w:val="num" w:pos="6480"/>
+        </w:tabs>
+        <w:ind w:left="6480" w:hanging="360"/>
+      </w:pPr>
+      <w:rPr>
+        <w:rFonts w:ascii="Wingdings" w:hAnsi="Wingdings" w:hint="default"/>
+        <w:sz w:val="20"/>
+      </w:rPr>
+    </w:lvl>
+  </w:abstractNum>
   <w:num w:numId="1" w16cid:durableId="1680236461">
+    <w:abstractNumId w:val="18"/>
+  </w:num>
+  <w:num w:numId="2" w16cid:durableId="962660974">
+    <w:abstractNumId w:val="10"/>
+  </w:num>
+  <w:num w:numId="3" w16cid:durableId="1489857531">
+    <w:abstractNumId w:val="9"/>
+  </w:num>
+  <w:num w:numId="4" w16cid:durableId="486170159">
+    <w:abstractNumId w:val="14"/>
+  </w:num>
+  <w:num w:numId="5" w16cid:durableId="1684043458">
+    <w:abstractNumId w:val="0"/>
+  </w:num>
+  <w:num w:numId="6" w16cid:durableId="1654331251">
+    <w:abstractNumId w:val="11"/>
+  </w:num>
+  <w:num w:numId="7" w16cid:durableId="2146385249">
+    <w:abstractNumId w:val="16"/>
+  </w:num>
+  <w:num w:numId="8" w16cid:durableId="138309321">
+    <w:abstractNumId w:val="12"/>
+  </w:num>
+  <w:num w:numId="9" w16cid:durableId="211582621">
+    <w:abstractNumId w:val="20"/>
+  </w:num>
+  <w:num w:numId="10" w16cid:durableId="993607554">
+    <w:abstractNumId w:val="5"/>
+  </w:num>
+  <w:num w:numId="11" w16cid:durableId="430199279">
+    <w:abstractNumId w:val="15"/>
+  </w:num>
+  <w:num w:numId="12" w16cid:durableId="221336852">
+    <w:abstractNumId w:val="3"/>
+  </w:num>
+  <w:num w:numId="13" w16cid:durableId="1059788132">
+    <w:abstractNumId w:val="6"/>
+  </w:num>
+  <w:num w:numId="14" w16cid:durableId="82142904">
     <w:abstractNumId w:val="1"/>
   </w:num>
-  <w:num w:numId="2" w16cid:durableId="962660974">
-    <w:abstractNumId w:val="0"/>
+  <w:num w:numId="15" w16cid:durableId="1199002913">
+    <w:abstractNumId w:val="17"/>
+  </w:num>
+  <w:num w:numId="16" w16cid:durableId="309678531">
+    <w:abstractNumId w:val="2"/>
+  </w:num>
+  <w:num w:numId="17" w16cid:durableId="211039922">
+    <w:abstractNumId w:val="21"/>
+  </w:num>
+  <w:num w:numId="18" w16cid:durableId="2080327105">
+    <w:abstractNumId w:val="4"/>
+  </w:num>
+  <w:num w:numId="19" w16cid:durableId="1991327712">
+    <w:abstractNumId w:val="7"/>
+  </w:num>
+  <w:num w:numId="20" w16cid:durableId="749304669">
+    <w:abstractNumId w:val="8"/>
+  </w:num>
+  <w:num w:numId="21" w16cid:durableId="2115854504">
+    <w:abstractNumId w:val="19"/>
+  </w:num>
+  <w:num w:numId="22" w16cid:durableId="329794464">
+    <w:abstractNumId w:val="13"/>
   </w:num>
 </w:numbering>
 </file>

</xml_diff>